<commit_message>
written text in documentation
</commit_message>
<xml_diff>
--- a/Documentation.docx
+++ b/Documentation.docx
@@ -1,6 +1,6 @@
 
 <file path=word/document.xml><?xml version="1.0" encoding="utf-8"?>
-<w:document xmlns:wpc="http://schemas.microsoft.com/office/word/2010/wordprocessingCanvas" xmlns:cx="http://schemas.microsoft.com/office/drawing/2014/chartex" xmlns:mc="http://schemas.openxmlformats.org/markup-compatibility/2006" xmlns:o="urn:schemas-microsoft-com:office:office" xmlns:r="http://schemas.openxmlformats.org/officeDocument/2006/relationships" xmlns:m="http://schemas.openxmlformats.org/officeDocument/2006/math" xmlns:v="urn:schemas-microsoft-com:vml" xmlns:wp14="http://schemas.microsoft.com/office/word/2010/wordprocessingDrawing" xmlns:wp="http://schemas.openxmlformats.org/drawingml/2006/wordprocessingDrawing" xmlns:w10="urn:schemas-microsoft-com:office:word" xmlns:w="http://schemas.openxmlformats.org/wordprocessingml/2006/main" xmlns:w14="http://schemas.microsoft.com/office/word/2010/wordml" xmlns:w15="http://schemas.microsoft.com/office/word/2012/wordml" xmlns:w16se="http://schemas.microsoft.com/office/word/2015/wordml/symex" xmlns:wpg="http://schemas.microsoft.com/office/word/2010/wordprocessingGroup" xmlns:wpi="http://schemas.microsoft.com/office/word/2010/wordprocessingInk" xmlns:wne="http://schemas.microsoft.com/office/word/2006/wordml" xmlns:wps="http://schemas.microsoft.com/office/word/2010/wordprocessingShape" mc:Ignorable="w14 w15 w16se wp14">
+<w:document xmlns:wpc="http://schemas.microsoft.com/office/word/2010/wordprocessingCanvas" xmlns:cx="http://schemas.microsoft.com/office/drawing/2014/chartex" xmlns:cx1="http://schemas.microsoft.com/office/drawing/2015/9/8/chartex" xmlns:cx2="http://schemas.microsoft.com/office/drawing/2015/10/21/chartex" xmlns:cx3="http://schemas.microsoft.com/office/drawing/2016/5/9/chartex" xmlns:cx4="http://schemas.microsoft.com/office/drawing/2016/5/10/chartex" xmlns:cx5="http://schemas.microsoft.com/office/drawing/2016/5/11/chartex" xmlns:cx6="http://schemas.microsoft.com/office/drawing/2016/5/12/chartex" xmlns:cx7="http://schemas.microsoft.com/office/drawing/2016/5/13/chartex" xmlns:cx8="http://schemas.microsoft.com/office/drawing/2016/5/14/chartex" xmlns:mc="http://schemas.openxmlformats.org/markup-compatibility/2006" xmlns:aink="http://schemas.microsoft.com/office/drawing/2016/ink" xmlns:am3d="http://schemas.microsoft.com/office/drawing/2017/model3d" xmlns:o="urn:schemas-microsoft-com:office:office" xmlns:oel="http://schemas.microsoft.com/office/2019/extlst" xmlns:r="http://schemas.openxmlformats.org/officeDocument/2006/relationships" xmlns:m="http://schemas.openxmlformats.org/officeDocument/2006/math" xmlns:v="urn:schemas-microsoft-com:vml" xmlns:wp14="http://schemas.microsoft.com/office/word/2010/wordprocessingDrawing" xmlns:wp="http://schemas.openxmlformats.org/drawingml/2006/wordprocessingDrawing" xmlns:w10="urn:schemas-microsoft-com:office:word" xmlns:w="http://schemas.openxmlformats.org/wordprocessingml/2006/main" xmlns:w14="http://schemas.microsoft.com/office/word/2010/wordml" xmlns:w15="http://schemas.microsoft.com/office/word/2012/wordml" xmlns:w16cex="http://schemas.microsoft.com/office/word/2018/wordml/cex" xmlns:w16cid="http://schemas.microsoft.com/office/word/2016/wordml/cid" xmlns:w16="http://schemas.microsoft.com/office/word/2018/wordml" xmlns:w16du="http://schemas.microsoft.com/office/word/2023/wordml/word16du" xmlns:w16sdtdh="http://schemas.microsoft.com/office/word/2020/wordml/sdtdatahash" xmlns:w16sdtfl="http://schemas.microsoft.com/office/word/2024/wordml/sdtformatlock" xmlns:w16se="http://schemas.microsoft.com/office/word/2015/wordml/symex" xmlns:wpg="http://schemas.microsoft.com/office/word/2010/wordprocessingGroup" xmlns:wpi="http://schemas.microsoft.com/office/word/2010/wordprocessingInk" xmlns:wne="http://schemas.microsoft.com/office/word/2006/wordml" xmlns:wps="http://schemas.microsoft.com/office/word/2010/wordprocessingShape" mc:Ignorable="w14 w15 w16se w16cid w16 w16cex w16sdtdh w16sdtfl w16du wp14">
   <w:body>
     <w:tbl>
       <w:tblPr>
@@ -72,7 +72,15 @@
                 <w:sz w:val="32"/>
                 <w:szCs w:val="32"/>
               </w:rPr>
-              <w:t xml:space="preserve">Самостоятельная работа студента </w:t>
+              <w:t>Практическая</w:t>
+            </w:r>
+            <w:r>
+              <w:rPr>
+                <w:rFonts w:eastAsia="Arial Unicode MS"/>
+                <w:sz w:val="32"/>
+                <w:szCs w:val="32"/>
+              </w:rPr>
+              <w:t xml:space="preserve"> работа студента </w:t>
             </w:r>
           </w:p>
           <w:p>
@@ -91,7 +99,7 @@
                 <w:sz w:val="32"/>
                 <w:szCs w:val="32"/>
               </w:rPr>
-              <w:t>по МДК 05.01.</w:t>
+              <w:t xml:space="preserve">по </w:t>
             </w:r>
             <w:r>
               <w:rPr>
@@ -99,14 +107,7 @@
                 <w:sz w:val="32"/>
                 <w:szCs w:val="32"/>
               </w:rPr>
-              <w:br/>
-            </w:r>
-            <w:r>
-              <w:rPr>
-                <w:sz w:val="32"/>
-                <w:szCs w:val="32"/>
-              </w:rPr>
-              <w:t>Проектирование и дизайн информационных систем</w:t>
+              <w:t>Практике</w:t>
             </w:r>
           </w:p>
           <w:p>
@@ -227,7 +228,7 @@
                 <w:sz w:val="28"/>
                 <w:szCs w:val="28"/>
               </w:rPr>
-              <w:t xml:space="preserve"> Т</w:t>
+              <w:t xml:space="preserve"> </w:t>
             </w:r>
             <w:r>
               <w:rPr>
@@ -237,16 +238,18 @@
                 <w:sz w:val="28"/>
                 <w:szCs w:val="28"/>
               </w:rPr>
-              <w:t>ОРГОВО-РАЗВЛЕКАТЕЛЬНОГО ЦЕНТРА</w:t>
+              <w:t xml:space="preserve">игровой студии </w:t>
             </w:r>
             <w:r>
               <w:rPr>
                 <w:rFonts w:ascii="Times New Roman" w:hAnsi="Times New Roman" w:cs="Times New Roman"/>
                 <w:b/>
+                <w:caps/>
                 <w:sz w:val="28"/>
                 <w:szCs w:val="28"/>
+                <w:lang w:val="en-US"/>
               </w:rPr>
-              <w:t xml:space="preserve"> «Акварель»</w:t>
+              <w:t>“pixel smith studio”</w:t>
             </w:r>
           </w:p>
           <w:p>
@@ -263,7 +266,7 @@
               <w:t>«</w:t>
             </w:r>
             <w:r>
-              <w:t>Развлекательный центр</w:t>
+              <w:t>Разработка видеоигр</w:t>
             </w:r>
             <w:r>
               <w:t>»</w:t>
@@ -435,7 +438,7 @@
                       <w:rFonts w:eastAsia="Arial Unicode MS"/>
                       <w:szCs w:val="24"/>
                     </w:rPr>
-                    <w:t>И.А. Бочарова</w:t>
+                    <w:t>Д.А. Чеметев</w:t>
                   </w:r>
                 </w:p>
               </w:tc>
@@ -2641,7 +2644,7 @@
           <w:sz w:val="28"/>
           <w:szCs w:val="28"/>
         </w:rPr>
-        <w:t>Торгово-развлекательный центр «Акварель» представляет собой многофункциональный комплекс, предназначенный для организации торговли, досуга и предоставления услуг населению. В состав торгово-развлекательного центра входят торговые галереи, зоны общественного питания, развлекательные площадки, парковка, а также служебные и административные помещения.</w:t>
+        <w:t>Pixel Smith Studio — независимая инди-студия по разработке компьютерных игр. Студия занимается созданием 2D-игр в жанре платформер с пиксельной графикой. На данный момент студия выпустила два проекта: Core Escape и Dinosaur Run, доступных на платформах itch.io, Яндекс Игры, VK Play и RuStore.</w:t>
       </w:r>
     </w:p>
     <w:p>
@@ -2661,7 +2664,7 @@
           <w:sz w:val="28"/>
           <w:szCs w:val="28"/>
         </w:rPr>
-        <w:t>Основной деятельностью торгово-развлекательного центра является обеспечение комфортных и безопасных условий для посетителей, арендаторов и сотрудников, а также эффективное управление торговыми и сервисными процессами.</w:t>
+        <w:t>Основной деятельностью студии является разработка видеоигр, привлечение игроков и взаимодействие с сообществом через информационный веб-сайт.</w:t>
       </w:r>
     </w:p>
     <w:p>
@@ -2681,7 +2684,15 @@
           <w:sz w:val="28"/>
           <w:szCs w:val="28"/>
         </w:rPr>
-        <w:t>Торгово-развлекательный центр предназначен</w:t>
+        <w:t>Веб-сайт студии</w:t>
+      </w:r>
+      <w:r>
+        <w:rPr>
+          <w:rFonts w:ascii="Times New Roman" w:hAnsi="Times New Roman" w:cs="Times New Roman"/>
+          <w:sz w:val="28"/>
+          <w:szCs w:val="28"/>
+        </w:rPr>
+        <w:t xml:space="preserve"> предназначен</w:t>
       </w:r>
       <w:r>
         <w:rPr>
@@ -2724,7 +2735,15 @@
           <w:sz w:val="28"/>
           <w:szCs w:val="28"/>
         </w:rPr>
-        <w:t>предоставления посетителям доступа к торговым, развлекательным и сервисным услугам;</w:t>
+        <w:t>Предоставления информации об играх, команде и деятельности студии</w:t>
+      </w:r>
+      <w:r>
+        <w:rPr>
+          <w:rFonts w:ascii="Times New Roman" w:hAnsi="Times New Roman" w:cs="Times New Roman"/>
+          <w:sz w:val="28"/>
+          <w:szCs w:val="28"/>
+        </w:rPr>
+        <w:t>;</w:t>
       </w:r>
     </w:p>
     <w:p>
@@ -2751,7 +2770,15 @@
           <w:sz w:val="28"/>
           <w:szCs w:val="28"/>
         </w:rPr>
-        <w:t>организации эффективного взаимодействия между администрацией ТРЦ, арендаторами и посетителями;</w:t>
+        <w:t>Публикации новостей об обновлении проектов</w:t>
+      </w:r>
+      <w:r>
+        <w:rPr>
+          <w:rFonts w:ascii="Times New Roman" w:hAnsi="Times New Roman" w:cs="Times New Roman"/>
+          <w:sz w:val="28"/>
+          <w:szCs w:val="28"/>
+        </w:rPr>
+        <w:t>;</w:t>
       </w:r>
     </w:p>
     <w:p>
@@ -2778,7 +2805,43 @@
           <w:sz w:val="28"/>
           <w:szCs w:val="28"/>
         </w:rPr>
-        <w:t>обеспечения безопасности, навигации и информирования посетителей на территории центра.</w:t>
+        <w:t>Предоставление ссылок на страницы игр на внешних платформах</w:t>
+      </w:r>
+      <w:r>
+        <w:rPr>
+          <w:rFonts w:ascii="Times New Roman" w:hAnsi="Times New Roman" w:cs="Times New Roman"/>
+          <w:sz w:val="28"/>
+          <w:szCs w:val="28"/>
+          <w:lang w:val="en-US"/>
+        </w:rPr>
+        <w:t>;</w:t>
+      </w:r>
+    </w:p>
+    <w:p>
+      <w:pPr>
+        <w:numPr>
+          <w:ilvl w:val="0"/>
+          <w:numId w:val="28"/>
+        </w:numPr>
+        <w:tabs>
+          <w:tab w:val="clear" w:pos="720"/>
+        </w:tabs>
+        <w:spacing w:after="0" w:line="360" w:lineRule="auto"/>
+        <w:ind w:left="0" w:firstLine="0"/>
+        <w:jc w:val="both"/>
+        <w:rPr>
+          <w:rFonts w:ascii="Times New Roman" w:hAnsi="Times New Roman" w:cs="Times New Roman"/>
+          <w:sz w:val="28"/>
+          <w:szCs w:val="28"/>
+        </w:rPr>
+      </w:pPr>
+      <w:r>
+        <w:rPr>
+          <w:rFonts w:ascii="Times New Roman" w:hAnsi="Times New Roman" w:cs="Times New Roman"/>
+          <w:sz w:val="28"/>
+          <w:szCs w:val="28"/>
+        </w:rPr>
+        <w:t>Демонстрации статистики игроков и партнёрской информации.</w:t>
       </w:r>
     </w:p>
     <w:p>
@@ -2826,23 +2889,15 @@
           <w:sz w:val="28"/>
           <w:szCs w:val="28"/>
         </w:rPr>
-        <w:t>п</w:t>
-      </w:r>
-      <w:r>
-        <w:rPr>
-          <w:rFonts w:ascii="Times New Roman" w:hAnsi="Times New Roman" w:cs="Times New Roman"/>
-          <w:sz w:val="28"/>
-          <w:szCs w:val="28"/>
-        </w:rPr>
-        <w:t>ользовател</w:t>
-      </w:r>
-      <w:r>
-        <w:rPr>
-          <w:rFonts w:ascii="Times New Roman" w:hAnsi="Times New Roman" w:cs="Times New Roman"/>
-          <w:sz w:val="28"/>
-          <w:szCs w:val="28"/>
-        </w:rPr>
-        <w:t>ь торгово-развлекательного центра (пользователь);</w:t>
+        <w:t>Посетитель сайта (пользователь)</w:t>
+      </w:r>
+      <w:r>
+        <w:rPr>
+          <w:rFonts w:ascii="Times New Roman" w:hAnsi="Times New Roman" w:cs="Times New Roman"/>
+          <w:sz w:val="28"/>
+          <w:szCs w:val="28"/>
+        </w:rPr>
+        <w:t>;</w:t>
       </w:r>
     </w:p>
     <w:p>
@@ -2878,7 +2933,23 @@
           <w:sz w:val="28"/>
           <w:szCs w:val="28"/>
         </w:rPr>
-        <w:t xml:space="preserve"> ТРЦ.</w:t>
+        <w:t xml:space="preserve"> </w:t>
+      </w:r>
+      <w:r>
+        <w:rPr>
+          <w:rFonts w:ascii="Times New Roman" w:hAnsi="Times New Roman" w:cs="Times New Roman"/>
+          <w:sz w:val="28"/>
+          <w:szCs w:val="28"/>
+        </w:rPr>
+        <w:t>студии</w:t>
+      </w:r>
+      <w:r>
+        <w:rPr>
+          <w:rFonts w:ascii="Times New Roman" w:hAnsi="Times New Roman" w:cs="Times New Roman"/>
+          <w:sz w:val="28"/>
+          <w:szCs w:val="28"/>
+        </w:rPr>
+        <w:t>.</w:t>
       </w:r>
     </w:p>
     <w:p>
@@ -2972,7 +3043,7 @@
           <w:sz w:val="28"/>
           <w:szCs w:val="28"/>
         </w:rPr>
-        <w:t>осуществлять поиск ассортимента</w:t>
+        <w:t>просматривать информацию об играх студии</w:t>
       </w:r>
       <w:r>
         <w:rPr>
@@ -3007,15 +3078,15 @@
           <w:sz w:val="28"/>
           <w:szCs w:val="28"/>
         </w:rPr>
-        <w:t xml:space="preserve">создавать </w:t>
-      </w:r>
-      <w:r>
-        <w:rPr>
-          <w:rFonts w:ascii="Times New Roman" w:hAnsi="Times New Roman" w:cs="Times New Roman"/>
-          <w:sz w:val="28"/>
-          <w:szCs w:val="28"/>
-        </w:rPr>
-        <w:t>обращения, отзывы и жалобы;</w:t>
+        <w:t>читать новости об обновлениях игр</w:t>
+      </w:r>
+      <w:r>
+        <w:rPr>
+          <w:rFonts w:ascii="Times New Roman" w:hAnsi="Times New Roman" w:cs="Times New Roman"/>
+          <w:sz w:val="28"/>
+          <w:szCs w:val="28"/>
+        </w:rPr>
+        <w:t>;</w:t>
       </w:r>
     </w:p>
     <w:p>
@@ -3043,13 +3114,50 @@
           <w:sz w:val="28"/>
           <w:szCs w:val="28"/>
         </w:rPr>
-        <w:t>получать ответ на обращение от администрации на почту</w:t>
-      </w:r>
-      <w:r>
-        <w:rPr>
-          <w:rFonts w:ascii="Times New Roman" w:hAnsi="Times New Roman" w:cs="Times New Roman"/>
-          <w:sz w:val="28"/>
-          <w:szCs w:val="28"/>
+        <w:t>переходить по ссылкам на страницы игр</w:t>
+      </w:r>
+      <w:r>
+        <w:rPr>
+          <w:rFonts w:ascii="Times New Roman" w:hAnsi="Times New Roman" w:cs="Times New Roman"/>
+          <w:sz w:val="28"/>
+          <w:szCs w:val="28"/>
+        </w:rPr>
+        <w:t>;</w:t>
+      </w:r>
+    </w:p>
+    <w:p>
+      <w:pPr>
+        <w:numPr>
+          <w:ilvl w:val="0"/>
+          <w:numId w:val="18"/>
+        </w:numPr>
+        <w:tabs>
+          <w:tab w:val="clear" w:pos="720"/>
+          <w:tab w:val="num" w:pos="709"/>
+        </w:tabs>
+        <w:spacing w:after="0" w:line="360" w:lineRule="auto"/>
+        <w:ind w:left="0" w:firstLine="0"/>
+        <w:jc w:val="both"/>
+        <w:rPr>
+          <w:rFonts w:ascii="Times New Roman" w:hAnsi="Times New Roman" w:cs="Times New Roman"/>
+          <w:sz w:val="28"/>
+          <w:szCs w:val="28"/>
+        </w:rPr>
+      </w:pPr>
+      <w:r>
+        <w:rPr>
+          <w:rFonts w:ascii="Times New Roman" w:hAnsi="Times New Roman" w:cs="Times New Roman"/>
+          <w:sz w:val="28"/>
+          <w:szCs w:val="28"/>
+        </w:rPr>
+        <w:t>зарегистрироваться и подписаться на рекламную рассылку</w:t>
+      </w:r>
+      <w:r>
+        <w:rPr>
+          <w:rFonts w:ascii="Times New Roman" w:hAnsi="Times New Roman" w:cs="Times New Roman"/>
+          <w:sz w:val="28"/>
+          <w:szCs w:val="28"/>
+          <w:lang w:val="en-US"/>
         </w:rPr>
         <w:t>;</w:t>
       </w:r>
@@ -3099,7 +3207,25 @@
           <w:sz w:val="28"/>
           <w:szCs w:val="28"/>
         </w:rPr>
-        <w:t xml:space="preserve"> ТРЦ сможет:</w:t>
+        <w:t xml:space="preserve"> </w:t>
+      </w:r>
+      <w:r>
+        <w:rPr>
+          <w:rFonts w:ascii="Times New Roman" w:hAnsi="Times New Roman" w:cs="Times New Roman"/>
+          <w:bCs/>
+          <w:sz w:val="28"/>
+          <w:szCs w:val="28"/>
+        </w:rPr>
+        <w:t>студии сможет</w:t>
+      </w:r>
+      <w:r>
+        <w:rPr>
+          <w:rFonts w:ascii="Times New Roman" w:hAnsi="Times New Roman" w:cs="Times New Roman"/>
+          <w:bCs/>
+          <w:sz w:val="28"/>
+          <w:szCs w:val="28"/>
+        </w:rPr>
+        <w:t>:</w:t>
       </w:r>
     </w:p>
     <w:p>
@@ -3127,7 +3253,7 @@
           <w:sz w:val="28"/>
           <w:szCs w:val="28"/>
         </w:rPr>
-        <w:t>рассматривать обращения пользователей</w:t>
+        <w:t>публиковать новости и обновления</w:t>
       </w:r>
       <w:r>
         <w:rPr>
@@ -3163,8 +3289,7 @@
           <w:sz w:val="28"/>
           <w:szCs w:val="28"/>
         </w:rPr>
-        <w:lastRenderedPageBreak/>
-        <w:t>осуществлять обратную связь с пользователем</w:t>
+        <w:t>просматривать статистику посещаемости сайта</w:t>
       </w:r>
       <w:r>
         <w:rPr>
@@ -3200,7 +3325,7 @@
           <w:sz w:val="28"/>
           <w:szCs w:val="28"/>
         </w:rPr>
-        <w:t>создавать ассортимент</w:t>
+        <w:t>управлять контентом страниц</w:t>
       </w:r>
       <w:r>
         <w:rPr>
@@ -3231,7 +3356,24 @@
           <w:sz w:val="28"/>
           <w:szCs w:val="28"/>
         </w:rPr>
-        <w:t>Работу администрации торгово-развлекательного центра регламентируют следующие документы:</w:t>
+        <w:lastRenderedPageBreak/>
+        <w:t xml:space="preserve">Работу </w:t>
+      </w:r>
+      <w:r>
+        <w:rPr>
+          <w:rFonts w:ascii="Times New Roman" w:hAnsi="Times New Roman" w:cs="Times New Roman"/>
+          <w:sz w:val="28"/>
+          <w:szCs w:val="28"/>
+        </w:rPr>
+        <w:t>студии</w:t>
+      </w:r>
+      <w:r>
+        <w:rPr>
+          <w:rFonts w:ascii="Times New Roman" w:hAnsi="Times New Roman" w:cs="Times New Roman"/>
+          <w:sz w:val="28"/>
+          <w:szCs w:val="28"/>
+        </w:rPr>
+        <w:t xml:space="preserve"> регламентируют следующие документы:</w:t>
       </w:r>
     </w:p>
     <w:p>
@@ -3367,114 +3509,33 @@
           <w:sz w:val="28"/>
           <w:szCs w:val="28"/>
         </w:rPr>
-        <w:t>правила внутреннего распорядка и регламенты ТРЦ «Акварель».</w:t>
-      </w:r>
-    </w:p>
-    <w:p>
-      <w:pPr>
-        <w:tabs>
-          <w:tab w:val="num" w:pos="709"/>
-        </w:tabs>
-        <w:spacing w:after="0" w:line="360" w:lineRule="auto"/>
-        <w:ind w:firstLine="709"/>
-        <w:jc w:val="both"/>
-        <w:rPr>
-          <w:rFonts w:ascii="Times New Roman" w:hAnsi="Times New Roman" w:cs="Times New Roman"/>
-          <w:sz w:val="28"/>
-          <w:szCs w:val="28"/>
-        </w:rPr>
-      </w:pPr>
-      <w:r>
-        <w:rPr>
-          <w:rFonts w:ascii="Times New Roman" w:hAnsi="Times New Roman" w:cs="Times New Roman"/>
-          <w:sz w:val="28"/>
-          <w:szCs w:val="28"/>
-        </w:rPr>
-        <w:t>Сотрудники администрации ТРЦ ведут следующие документы:</w:t>
-      </w:r>
-    </w:p>
-    <w:p>
-      <w:pPr>
-        <w:numPr>
-          <w:ilvl w:val="0"/>
-          <w:numId w:val="22"/>
-        </w:numPr>
-        <w:tabs>
-          <w:tab w:val="clear" w:pos="720"/>
-          <w:tab w:val="num" w:pos="709"/>
-        </w:tabs>
-        <w:spacing w:after="0" w:line="360" w:lineRule="auto"/>
-        <w:ind w:left="0" w:firstLine="0"/>
-        <w:jc w:val="both"/>
-        <w:rPr>
-          <w:rFonts w:ascii="Times New Roman" w:hAnsi="Times New Roman" w:cs="Times New Roman"/>
-          <w:sz w:val="28"/>
-          <w:szCs w:val="28"/>
-        </w:rPr>
-      </w:pPr>
-      <w:r>
-        <w:rPr>
-          <w:rFonts w:ascii="Times New Roman" w:hAnsi="Times New Roman" w:cs="Times New Roman"/>
-          <w:sz w:val="28"/>
-          <w:szCs w:val="28"/>
-        </w:rPr>
-        <w:t>журнал учёта обращений посетителей;</w:t>
-      </w:r>
-    </w:p>
-    <w:p>
-      <w:pPr>
-        <w:numPr>
-          <w:ilvl w:val="0"/>
-          <w:numId w:val="22"/>
-        </w:numPr>
-        <w:tabs>
-          <w:tab w:val="clear" w:pos="720"/>
-          <w:tab w:val="num" w:pos="709"/>
-        </w:tabs>
-        <w:spacing w:after="0" w:line="360" w:lineRule="auto"/>
-        <w:ind w:left="0" w:firstLine="0"/>
-        <w:jc w:val="both"/>
-        <w:rPr>
-          <w:rFonts w:ascii="Times New Roman" w:hAnsi="Times New Roman" w:cs="Times New Roman"/>
-          <w:sz w:val="28"/>
-          <w:szCs w:val="28"/>
-        </w:rPr>
-      </w:pPr>
-      <w:r>
-        <w:rPr>
-          <w:rFonts w:ascii="Times New Roman" w:hAnsi="Times New Roman" w:cs="Times New Roman"/>
-          <w:sz w:val="28"/>
-          <w:szCs w:val="28"/>
-        </w:rPr>
-        <w:t>отчёты по обращениям, отзывам и жалобам;</w:t>
-      </w:r>
-    </w:p>
-    <w:p>
-      <w:pPr>
-        <w:numPr>
-          <w:ilvl w:val="0"/>
-          <w:numId w:val="22"/>
-        </w:numPr>
-        <w:tabs>
-          <w:tab w:val="clear" w:pos="720"/>
-          <w:tab w:val="num" w:pos="709"/>
-        </w:tabs>
-        <w:spacing w:after="0" w:line="360" w:lineRule="auto"/>
-        <w:ind w:left="0" w:firstLine="0"/>
-        <w:jc w:val="both"/>
-        <w:rPr>
-          <w:rFonts w:ascii="Times New Roman" w:hAnsi="Times New Roman" w:cs="Times New Roman"/>
-          <w:sz w:val="28"/>
-          <w:szCs w:val="28"/>
-        </w:rPr>
-      </w:pPr>
-      <w:r>
-        <w:rPr>
-          <w:rFonts w:ascii="Times New Roman" w:hAnsi="Times New Roman" w:cs="Times New Roman"/>
-          <w:sz w:val="28"/>
-          <w:szCs w:val="28"/>
-        </w:rPr>
-        <w:t>отчёты о проведённых мероприятиях и акциях.</w:t>
+        <w:t xml:space="preserve">Пользовательские соглашения платформ </w:t>
+      </w:r>
+      <w:r>
+        <w:rPr>
+          <w:rFonts w:ascii="Times New Roman" w:hAnsi="Times New Roman" w:cs="Times New Roman"/>
+          <w:sz w:val="28"/>
+          <w:szCs w:val="28"/>
+          <w:lang w:val="en-US"/>
+        </w:rPr>
+        <w:t xml:space="preserve">itch.io, </w:t>
+      </w:r>
+      <w:r>
+        <w:rPr>
+          <w:rFonts w:ascii="Times New Roman" w:hAnsi="Times New Roman" w:cs="Times New Roman"/>
+          <w:sz w:val="28"/>
+          <w:szCs w:val="28"/>
+        </w:rPr>
+        <w:t xml:space="preserve">Яндекс Игры, </w:t>
+      </w:r>
+      <w:r>
+        <w:rPr>
+          <w:rFonts w:ascii="Times New Roman" w:hAnsi="Times New Roman" w:cs="Times New Roman"/>
+          <w:sz w:val="28"/>
+          <w:szCs w:val="28"/>
+          <w:lang w:val="en-US"/>
+        </w:rPr>
+        <w:t>VK Play, RuStore.</w:t>
       </w:r>
     </w:p>
     <w:p>
@@ -3512,7 +3573,7 @@
           <w:sz w:val="28"/>
           <w:szCs w:val="28"/>
         </w:rPr>
-        <w:t>Актуальность задачи заключается в повышении качества обслуживания посетителей торгово-развлекательного центра «Акварель», улучшении взаимодействия между посетителями и администрацией, а также в оптимизации процессов обработки обращений и информирования клиентов.</w:t>
+        <w:t>Актуальность задачи заключается в необходимости создания единого информационного ресурса для студии Pixel Smith Studio, обеспечивающего взаимодействие с аудиторией, публикацию новостей и продвижение игровых проектов.</w:t>
       </w:r>
     </w:p>
     <w:p>
@@ -3532,7 +3593,7 @@
           <w:sz w:val="28"/>
           <w:szCs w:val="28"/>
         </w:rPr>
-        <w:t>Использование автоматизированной системы позволит сократить время обработки обращений, повысить прозрачность работы администрации и обеспечить удобный доступ посетителей к актуальной информации о работе торгово-развлекательного центра.</w:t>
+        <w:t>Использование автоматизированной системы позволит централизовать информацию о студии и её проектах, обеспечить удобный доступ пользователей к актуальным новостям и ссылкам на игры, а также привлечь новых игроков.</w:t>
       </w:r>
     </w:p>
     <w:p>
@@ -3552,7 +3613,32 @@
           <w:sz w:val="28"/>
           <w:szCs w:val="28"/>
         </w:rPr>
-        <w:t>Учитывая собранные данные, разработана модель бизнес-процесса, позволяющая провести всесторонний анализ деятельности информационного ресурса. С использованием методологии функционального моделирования IDEF0 построена функциональная модель, отображающая структуру и функции портала торгово-развлекательного центра «Акварель», а также информационные потоки, связывающие эти функции (см. рисунок 1).</w:t>
+        <w:t xml:space="preserve">Учитывая собранные данные, разработана модель бизнес-процесса, позволяющая провести всесторонний анализ деятельности информационного ресурса. С использованием методологии функционального моделирования IDEF0 построена функциональная модель, отображающая структуру и функции портала </w:t>
+      </w:r>
+      <w:r>
+        <w:rPr>
+          <w:rFonts w:ascii="Times New Roman" w:hAnsi="Times New Roman" w:cs="Times New Roman"/>
+          <w:sz w:val="28"/>
+          <w:szCs w:val="28"/>
+        </w:rPr>
+        <w:t xml:space="preserve">видео-игровой студии </w:t>
+      </w:r>
+      <w:r>
+        <w:rPr>
+          <w:rFonts w:ascii="Times New Roman" w:hAnsi="Times New Roman" w:cs="Times New Roman"/>
+          <w:sz w:val="28"/>
+          <w:szCs w:val="28"/>
+          <w:lang w:val="en-US"/>
+        </w:rPr>
+        <w:t>“Pixel Smith Studio”</w:t>
+      </w:r>
+      <w:r>
+        <w:rPr>
+          <w:rFonts w:ascii="Times New Roman" w:hAnsi="Times New Roman" w:cs="Times New Roman"/>
+          <w:sz w:val="28"/>
+          <w:szCs w:val="28"/>
+        </w:rPr>
+        <w:t>, а также информационные потоки, связывающие эти функции (см. рисунок 1).</w:t>
       </w:r>
     </w:p>
     <w:p>
@@ -4237,8 +4323,10 @@
     </w:p>
     <w:p>
       <w:pPr>
+        <w:tabs>
+          <w:tab w:val="num" w:pos="709"/>
+        </w:tabs>
         <w:spacing w:after="0" w:line="360" w:lineRule="auto"/>
-        <w:ind w:firstLine="709"/>
         <w:jc w:val="both"/>
         <w:rPr>
           <w:rFonts w:ascii="Times New Roman" w:hAnsi="Times New Roman" w:cs="Times New Roman"/>
@@ -4252,7 +4340,40 @@
           <w:sz w:val="28"/>
           <w:szCs w:val="28"/>
         </w:rPr>
-        <w:t>Учитывая вышеперечисленное, можно сделать вывод, что для повышения эффективности работы администрации торгово-развлекательного центра «Акварель» и повышения уровня удовлетворённости посетителей, необходимо разработать портал, который будет решать следующие задачи:</w:t>
+        <w:tab/>
+      </w:r>
+      <w:r>
+        <w:rPr>
+          <w:rFonts w:ascii="Times New Roman" w:hAnsi="Times New Roman" w:cs="Times New Roman"/>
+          <w:sz w:val="28"/>
+          <w:szCs w:val="28"/>
+        </w:rPr>
+        <w:t>Учитывая вышеперечисленное, можно сделать вывод, что для обеспечения эффективного продвижения студии Pixel Smith Studio и взаимодействия с игровым сообществом, необходимо разработать информационный веб-сайт, который будет решать следующие</w:t>
+      </w:r>
+      <w:r>
+        <w:rPr>
+          <w:rFonts w:ascii="Times New Roman" w:hAnsi="Times New Roman" w:cs="Times New Roman"/>
+          <w:sz w:val="28"/>
+          <w:szCs w:val="28"/>
+        </w:rPr>
+        <w:t xml:space="preserve"> </w:t>
+      </w:r>
+      <w:r>
+        <w:rPr>
+          <w:rFonts w:ascii="Times New Roman" w:hAnsi="Times New Roman" w:cs="Times New Roman"/>
+          <w:sz w:val="28"/>
+          <w:szCs w:val="28"/>
+        </w:rPr>
+        <w:t>задачи</w:t>
+      </w:r>
+      <w:r>
+        <w:rPr>
+          <w:rFonts w:ascii="Times New Roman" w:hAnsi="Times New Roman" w:cs="Times New Roman"/>
+          <w:sz w:val="28"/>
+          <w:szCs w:val="28"/>
+          <w:lang w:val="en-US"/>
+        </w:rPr>
+        <w:t>:</w:t>
       </w:r>
     </w:p>
     <w:p>
@@ -4280,93 +4401,15 @@
           <w:sz w:val="28"/>
           <w:szCs w:val="28"/>
         </w:rPr>
-        <w:t>предоставление актуальной информации о</w:t>
-      </w:r>
-      <w:r>
-        <w:rPr>
-          <w:rFonts w:ascii="Times New Roman" w:hAnsi="Times New Roman" w:cs="Times New Roman"/>
-          <w:sz w:val="28"/>
-          <w:szCs w:val="28"/>
-        </w:rPr>
-        <w:t>б</w:t>
-      </w:r>
-      <w:r>
-        <w:rPr>
-          <w:rFonts w:ascii="Times New Roman" w:hAnsi="Times New Roman" w:cs="Times New Roman"/>
-          <w:sz w:val="28"/>
-          <w:szCs w:val="28"/>
-        </w:rPr>
-        <w:t xml:space="preserve"> </w:t>
-      </w:r>
-      <w:r>
-        <w:rPr>
-          <w:rFonts w:ascii="Times New Roman" w:hAnsi="Times New Roman" w:cs="Times New Roman"/>
-          <w:sz w:val="28"/>
-          <w:szCs w:val="28"/>
-        </w:rPr>
-        <w:t>ассортиме</w:t>
-      </w:r>
-      <w:bookmarkStart w:id="4" w:name="_GoBack"/>
-      <w:bookmarkEnd w:id="4"/>
-      <w:r>
-        <w:rPr>
-          <w:rFonts w:ascii="Times New Roman" w:hAnsi="Times New Roman" w:cs="Times New Roman"/>
-          <w:sz w:val="28"/>
-          <w:szCs w:val="28"/>
-        </w:rPr>
-        <w:t>нте магазинов, услуг</w:t>
-      </w:r>
-      <w:r>
-        <w:rPr>
-          <w:rFonts w:ascii="Times New Roman" w:hAnsi="Times New Roman" w:cs="Times New Roman"/>
-          <w:sz w:val="28"/>
-          <w:szCs w:val="28"/>
-        </w:rPr>
-        <w:t xml:space="preserve"> и раз</w:t>
-      </w:r>
-      <w:r>
-        <w:rPr>
-          <w:rFonts w:ascii="Times New Roman" w:hAnsi="Times New Roman" w:cs="Times New Roman"/>
-          <w:sz w:val="28"/>
-          <w:szCs w:val="28"/>
-        </w:rPr>
-        <w:t>влечений</w:t>
-      </w:r>
-      <w:r>
-        <w:rPr>
-          <w:rFonts w:ascii="Times New Roman" w:hAnsi="Times New Roman" w:cs="Times New Roman"/>
-          <w:sz w:val="28"/>
-          <w:szCs w:val="28"/>
-        </w:rPr>
-        <w:t xml:space="preserve"> ТРЦ;</w:t>
-      </w:r>
-    </w:p>
-    <w:p>
-      <w:pPr>
-        <w:numPr>
-          <w:ilvl w:val="0"/>
-          <w:numId w:val="23"/>
-        </w:numPr>
-        <w:tabs>
-          <w:tab w:val="clear" w:pos="720"/>
-          <w:tab w:val="num" w:pos="709"/>
-        </w:tabs>
-        <w:spacing w:after="0" w:line="360" w:lineRule="auto"/>
-        <w:ind w:left="0" w:firstLine="0"/>
-        <w:jc w:val="both"/>
-        <w:rPr>
-          <w:rFonts w:ascii="Times New Roman" w:hAnsi="Times New Roman" w:cs="Times New Roman"/>
-          <w:sz w:val="28"/>
-          <w:szCs w:val="28"/>
-        </w:rPr>
-      </w:pPr>
-      <w:r>
-        <w:rPr>
-          <w:rFonts w:ascii="Times New Roman" w:hAnsi="Times New Roman" w:cs="Times New Roman"/>
-          <w:sz w:val="28"/>
-          <w:szCs w:val="28"/>
-        </w:rPr>
-        <w:t>приём обращений, отзывов и жалоб посетителей;</w:t>
+        <w:t>Предоставление информации об играх и деятельности студии</w:t>
+      </w:r>
+      <w:r>
+        <w:rPr>
+          <w:rFonts w:ascii="Times New Roman" w:hAnsi="Times New Roman" w:cs="Times New Roman"/>
+          <w:sz w:val="28"/>
+          <w:szCs w:val="28"/>
+        </w:rPr>
+        <w:t>;</w:t>
       </w:r>
     </w:p>
     <w:p>
@@ -4390,23 +4433,107 @@
           <w:sz w:val="28"/>
           <w:szCs w:val="28"/>
         </w:rPr>
-        <w:t>обратная связь с пользователем используя</w:t>
-      </w:r>
-      <w:r>
-        <w:rPr>
-          <w:rFonts w:ascii="Times New Roman" w:hAnsi="Times New Roman" w:cs="Times New Roman"/>
-          <w:sz w:val="28"/>
-          <w:szCs w:val="28"/>
-        </w:rPr>
-        <w:t xml:space="preserve"> указанную почту</w:t>
-      </w:r>
-      <w:r>
-        <w:rPr>
-          <w:rFonts w:ascii="Times New Roman" w:hAnsi="Times New Roman" w:cs="Times New Roman"/>
-          <w:sz w:val="28"/>
-          <w:szCs w:val="28"/>
-        </w:rPr>
-        <w:t>.</w:t>
+        <w:t>Публикация новостей об обновлении игровых проектов</w:t>
+      </w:r>
+      <w:r>
+        <w:rPr>
+          <w:rFonts w:ascii="Times New Roman" w:hAnsi="Times New Roman" w:cs="Times New Roman"/>
+          <w:sz w:val="28"/>
+          <w:szCs w:val="28"/>
+          <w:lang w:val="en-US"/>
+        </w:rPr>
+        <w:t>;</w:t>
+      </w:r>
+    </w:p>
+    <w:p>
+      <w:pPr>
+        <w:numPr>
+          <w:ilvl w:val="0"/>
+          <w:numId w:val="23"/>
+        </w:numPr>
+        <w:spacing w:after="0" w:line="360" w:lineRule="auto"/>
+        <w:ind w:left="0" w:firstLine="0"/>
+        <w:jc w:val="both"/>
+        <w:rPr>
+          <w:rFonts w:ascii="Times New Roman" w:hAnsi="Times New Roman" w:cs="Times New Roman"/>
+          <w:sz w:val="28"/>
+          <w:szCs w:val="28"/>
+        </w:rPr>
+      </w:pPr>
+      <w:r>
+        <w:rPr>
+          <w:rFonts w:ascii="Times New Roman" w:hAnsi="Times New Roman" w:cs="Times New Roman"/>
+          <w:sz w:val="28"/>
+          <w:szCs w:val="28"/>
+        </w:rPr>
+        <w:t>Предоставление ссылок на страницы игр на внешних платформах</w:t>
+      </w:r>
+      <w:r>
+        <w:rPr>
+          <w:rFonts w:ascii="Times New Roman" w:hAnsi="Times New Roman" w:cs="Times New Roman"/>
+          <w:sz w:val="28"/>
+          <w:szCs w:val="28"/>
+          <w:lang w:val="en-US"/>
+        </w:rPr>
+        <w:t>;</w:t>
+      </w:r>
+    </w:p>
+    <w:p>
+      <w:pPr>
+        <w:numPr>
+          <w:ilvl w:val="0"/>
+          <w:numId w:val="23"/>
+        </w:numPr>
+        <w:spacing w:after="0" w:line="360" w:lineRule="auto"/>
+        <w:ind w:left="0" w:firstLine="0"/>
+        <w:jc w:val="both"/>
+        <w:rPr>
+          <w:rFonts w:ascii="Times New Roman" w:hAnsi="Times New Roman" w:cs="Times New Roman"/>
+          <w:sz w:val="28"/>
+          <w:szCs w:val="28"/>
+        </w:rPr>
+      </w:pPr>
+      <w:r>
+        <w:rPr>
+          <w:rFonts w:ascii="Times New Roman" w:hAnsi="Times New Roman" w:cs="Times New Roman"/>
+          <w:sz w:val="28"/>
+          <w:szCs w:val="28"/>
+        </w:rPr>
+        <w:t>Регистрация пользователей и подписка на рассылку новостей</w:t>
+      </w:r>
+      <w:r>
+        <w:rPr>
+          <w:rFonts w:ascii="Times New Roman" w:hAnsi="Times New Roman" w:cs="Times New Roman"/>
+          <w:sz w:val="28"/>
+          <w:szCs w:val="28"/>
+          <w:lang w:val="en-US"/>
+        </w:rPr>
+        <w:t>;</w:t>
+      </w:r>
+    </w:p>
+    <w:p>
+      <w:pPr>
+        <w:numPr>
+          <w:ilvl w:val="0"/>
+          <w:numId w:val="23"/>
+        </w:numPr>
+        <w:spacing w:after="0" w:line="360" w:lineRule="auto"/>
+        <w:ind w:left="0" w:firstLine="0"/>
+        <w:jc w:val="both"/>
+        <w:rPr>
+          <w:rFonts w:ascii="Times New Roman" w:hAnsi="Times New Roman" w:cs="Times New Roman"/>
+          <w:sz w:val="28"/>
+          <w:szCs w:val="28"/>
+        </w:rPr>
+      </w:pPr>
+      <w:r>
+        <w:rPr>
+          <w:rFonts w:ascii="Times New Roman" w:hAnsi="Times New Roman" w:cs="Times New Roman"/>
+          <w:sz w:val="28"/>
+          <w:szCs w:val="28"/>
+        </w:rPr>
+        <w:lastRenderedPageBreak/>
+        <w:t>Отображение статистики посещаемости игроков и информация о партнерах и рекламодателях.</w:t>
       </w:r>
     </w:p>
     <w:p>
@@ -4445,16 +4572,16 @@
           <w:lang w:val="ru-RU"/>
         </w:rPr>
       </w:pPr>
-      <w:bookmarkStart w:id="5" w:name="_Toc168482025"/>
-      <w:bookmarkStart w:id="6" w:name="_Toc195094588"/>
+      <w:bookmarkStart w:id="4" w:name="_Toc168482025"/>
+      <w:bookmarkStart w:id="5" w:name="_Toc195094588"/>
       <w:r>
         <w:rPr>
           <w:lang w:val="ru-RU"/>
         </w:rPr>
         <w:t>2.1. Введение</w:t>
       </w:r>
+      <w:bookmarkEnd w:id="4"/>
       <w:bookmarkEnd w:id="5"/>
-      <w:bookmarkEnd w:id="6"/>
     </w:p>
     <w:p>
       <w:pPr>
@@ -4471,7 +4598,7 @@
           <w:szCs w:val="28"/>
           <w:lang w:val="ru-RU"/>
         </w:rPr>
-        <w:t>Разрабатываемая информационная система называется «Портал торгово-развлекательного центра «Акварель», который будет использоваться в сети интернет.</w:t>
+        <w:t>Разрабатываемая информационная система называется «Веб-сайт игровой студии Pixel Smith Studio» и будет использоваться в сети интернет.</w:t>
       </w:r>
     </w:p>
     <w:p>
@@ -4485,16 +4612,16 @@
           <w:lang w:val="ru-RU"/>
         </w:rPr>
       </w:pPr>
-      <w:bookmarkStart w:id="7" w:name="_Toc168482026"/>
-      <w:bookmarkStart w:id="8" w:name="_Toc195094589"/>
+      <w:bookmarkStart w:id="6" w:name="_Toc168482026"/>
+      <w:bookmarkStart w:id="7" w:name="_Toc195094589"/>
       <w:r>
         <w:rPr>
           <w:lang w:val="ru-RU"/>
         </w:rPr>
         <w:t>2.2. Основания для разработки</w:t>
       </w:r>
+      <w:bookmarkEnd w:id="6"/>
       <w:bookmarkEnd w:id="7"/>
-      <w:bookmarkEnd w:id="8"/>
     </w:p>
     <w:p>
       <w:pPr>
@@ -4509,7 +4636,19 @@
         <w:rPr>
           <w:lang w:val="ru-RU"/>
         </w:rPr>
-        <w:t>Разработка информационной системы ведётся на основании задания по ПМ05 «Проектирование и разработка информационных систем» государственного бюджетного профессионального образовательного учреждения «Волгоградский инд</w:t>
+        <w:t xml:space="preserve">Разработка информационной системы ведётся на основании </w:t>
+      </w:r>
+      <w:r>
+        <w:rPr>
+          <w:lang w:val="ru-RU"/>
+        </w:rPr>
+        <w:t xml:space="preserve">практики от </w:t>
+      </w:r>
+      <w:r>
+        <w:rPr>
+          <w:lang w:val="ru-RU"/>
+        </w:rPr>
+        <w:t>государственного бюджетного профессионального образовательного учреждения «Волгоградский инд</w:t>
       </w:r>
       <w:r>
         <w:rPr>
@@ -4531,19 +4670,49 @@
         <w:rPr>
           <w:lang w:val="ru-RU"/>
         </w:rPr>
-        <w:t>Темой разработки является: «Разработка информационного веб-сайта для демонстрации услуг торгово-ра</w:t>
-      </w:r>
-      <w:r>
-        <w:rPr>
-          <w:lang w:val="ru-RU"/>
-        </w:rPr>
-        <w:t>звлекательного центра «Акварель</w:t>
-      </w:r>
-      <w:r>
-        <w:rPr>
-          <w:lang w:val="ru-RU"/>
-        </w:rPr>
-        <w:t>».</w:t>
+        <w:t xml:space="preserve">Темой разработки является: «Разработка информационного веб-сайта для демонстрации услуг </w:t>
+      </w:r>
+      <w:r>
+        <w:rPr>
+          <w:rFonts w:ascii="Arial" w:eastAsia="Arial" w:hAnsi="Arial" w:cs="Arial"/>
+          <w:sz w:val="24"/>
+          <w:szCs w:val="24"/>
+          <w:lang w:val="ru-RU"/>
+        </w:rPr>
+        <w:t xml:space="preserve">игровой студии </w:t>
+      </w:r>
+      <w:r>
+        <w:rPr>
+          <w:rFonts w:ascii="Arial" w:eastAsia="Arial" w:hAnsi="Arial" w:cs="Arial"/>
+          <w:sz w:val="24"/>
+          <w:szCs w:val="24"/>
+          <w:lang w:val="en-US"/>
+        </w:rPr>
+        <w:t>“</w:t>
+      </w:r>
+      <w:r>
+        <w:rPr>
+          <w:rFonts w:ascii="Arial" w:eastAsia="Arial" w:hAnsi="Arial" w:cs="Arial"/>
+          <w:sz w:val="24"/>
+          <w:szCs w:val="24"/>
+          <w:lang w:val="ru-RU"/>
+        </w:rPr>
+        <w:t>Pixel Smith Studio</w:t>
+      </w:r>
+      <w:r>
+        <w:rPr>
+          <w:rFonts w:ascii="Arial" w:eastAsia="Arial" w:hAnsi="Arial" w:cs="Arial"/>
+          <w:sz w:val="24"/>
+          <w:szCs w:val="24"/>
+          <w:lang w:val="en-US"/>
+        </w:rPr>
+        <w:t>”</w:t>
+      </w:r>
+      <w:r>
+        <w:rPr>
+          <w:lang w:val="ru-RU"/>
+        </w:rPr>
+        <w:t>.</w:t>
       </w:r>
     </w:p>
     <w:p>
@@ -4557,16 +4726,16 @@
           <w:lang w:val="ru-RU"/>
         </w:rPr>
       </w:pPr>
-      <w:bookmarkStart w:id="9" w:name="_Toc168482027"/>
-      <w:bookmarkStart w:id="10" w:name="_Toc195094590"/>
+      <w:bookmarkStart w:id="8" w:name="_Toc168482027"/>
+      <w:bookmarkStart w:id="9" w:name="_Toc195094590"/>
       <w:r>
         <w:rPr>
           <w:lang w:val="ru-RU"/>
         </w:rPr>
         <w:t>2.3. Назначение разработки</w:t>
       </w:r>
+      <w:bookmarkEnd w:id="8"/>
       <w:bookmarkEnd w:id="9"/>
-      <w:bookmarkEnd w:id="10"/>
     </w:p>
     <w:p>
       <w:pPr>
@@ -4582,13 +4751,41 @@
           <w:lang w:eastAsia="ru-RU"/>
         </w:rPr>
       </w:pPr>
-      <w:bookmarkStart w:id="11" w:name="_Toc168482028"/>
+      <w:bookmarkStart w:id="10" w:name="_Toc168482028"/>
       <w:r>
         <w:rPr>
           <w:szCs w:val="20"/>
           <w:lang w:eastAsia="ru-RU"/>
         </w:rPr>
-        <w:t xml:space="preserve">Разрабатываемый программный продукт предназначен для повышения качества информирования посетителей и улучшения взаимодействия между администрацией ТРЦ «Акварель» и его посетителями.  </w:t>
+        <w:t>Разрабатываемый программный продукт предназначен для</w:t>
+      </w:r>
+      <w:r>
+        <w:rPr>
+          <w:szCs w:val="20"/>
+          <w:lang w:eastAsia="ru-RU"/>
+        </w:rPr>
+        <w:t xml:space="preserve"> информирования посетителей об играх и деятельности студии </w:t>
+      </w:r>
+      <w:r>
+        <w:rPr>
+          <w:szCs w:val="20"/>
+          <w:lang w:val="en-US" w:eastAsia="ru-RU"/>
+        </w:rPr>
+        <w:t xml:space="preserve">Pixel Smith Studio, </w:t>
+      </w:r>
+      <w:r>
+        <w:rPr>
+          <w:szCs w:val="20"/>
+          <w:lang w:eastAsia="ru-RU"/>
+        </w:rPr>
+        <w:t>а также для взаимодействия с игровым сообществом</w:t>
+      </w:r>
+      <w:r>
+        <w:rPr>
+          <w:szCs w:val="20"/>
+          <w:lang w:eastAsia="ru-RU"/>
+        </w:rPr>
+        <w:t xml:space="preserve">.  </w:t>
       </w:r>
     </w:p>
     <w:p>
@@ -4635,49 +4832,14 @@
           <w:szCs w:val="20"/>
           <w:lang w:eastAsia="ru-RU"/>
         </w:rPr>
-        <w:t>предоставление информации о</w:t>
+        <w:t>Предоставление информации об играх, команде и новостях студии</w:t>
       </w:r>
       <w:r>
         <w:rPr>
           <w:szCs w:val="20"/>
           <w:lang w:eastAsia="ru-RU"/>
         </w:rPr>
-        <w:t>б ассортименте</w:t>
-      </w:r>
-      <w:r>
-        <w:rPr>
-          <w:szCs w:val="20"/>
-          <w:lang w:eastAsia="ru-RU"/>
-        </w:rPr>
-        <w:t xml:space="preserve"> магазин</w:t>
-      </w:r>
-      <w:r>
-        <w:rPr>
-          <w:szCs w:val="20"/>
-          <w:lang w:eastAsia="ru-RU"/>
-        </w:rPr>
-        <w:t>ов</w:t>
-      </w:r>
-      <w:r>
-        <w:rPr>
-          <w:szCs w:val="20"/>
-          <w:lang w:eastAsia="ru-RU"/>
-        </w:rPr>
-        <w:t>, ресторан</w:t>
-      </w:r>
-      <w:r>
-        <w:rPr>
-          <w:szCs w:val="20"/>
-          <w:lang w:eastAsia="ru-RU"/>
-        </w:rPr>
-        <w:t>ов</w:t>
-      </w:r>
-      <w:r>
-        <w:rPr>
-          <w:szCs w:val="20"/>
-          <w:lang w:eastAsia="ru-RU"/>
-        </w:rPr>
-        <w:t xml:space="preserve"> и развлекательных зонах; </w:t>
+        <w:t xml:space="preserve">; </w:t>
       </w:r>
     </w:p>
     <w:p>
@@ -4702,7 +4864,46 @@
           <w:szCs w:val="20"/>
           <w:lang w:eastAsia="ru-RU"/>
         </w:rPr>
-        <w:t xml:space="preserve">приём обращений, отзывов и предложений от посетителей; </w:t>
+        <w:t>Регистрация пользователей и подписка на новостную рассылку</w:t>
+      </w:r>
+      <w:r>
+        <w:rPr>
+          <w:szCs w:val="20"/>
+          <w:lang w:eastAsia="ru-RU"/>
+        </w:rPr>
+        <w:t>;</w:t>
+      </w:r>
+    </w:p>
+    <w:p>
+      <w:pPr>
+        <w:pStyle w:val="a3"/>
+        <w:widowControl/>
+        <w:numPr>
+          <w:ilvl w:val="0"/>
+          <w:numId w:val="24"/>
+        </w:numPr>
+        <w:autoSpaceDE/>
+        <w:autoSpaceDN/>
+        <w:spacing w:before="0" w:line="360" w:lineRule="auto"/>
+        <w:jc w:val="both"/>
+        <w:rPr>
+          <w:szCs w:val="20"/>
+          <w:lang w:eastAsia="ru-RU"/>
+        </w:rPr>
+      </w:pPr>
+      <w:r>
+        <w:rPr>
+          <w:szCs w:val="20"/>
+          <w:lang w:eastAsia="ru-RU"/>
+        </w:rPr>
+        <w:t>Отображение статистики и партнерской информации.</w:t>
+      </w:r>
+      <w:r>
+        <w:rPr>
+          <w:szCs w:val="20"/>
+          <w:lang w:eastAsia="ru-RU"/>
+        </w:rPr>
+        <w:t xml:space="preserve"> </w:t>
       </w:r>
     </w:p>
     <w:p>
@@ -4720,15 +4921,15 @@
           <w:lang w:val="ru-RU"/>
         </w:rPr>
       </w:pPr>
-      <w:bookmarkStart w:id="12" w:name="_Toc195094591"/>
+      <w:bookmarkStart w:id="11" w:name="_Toc195094591"/>
       <w:r>
         <w:rPr>
           <w:lang w:val="ru-RU"/>
         </w:rPr>
         <w:t>Требования к программе или программному изделию</w:t>
       </w:r>
+      <w:bookmarkEnd w:id="10"/>
       <w:bookmarkEnd w:id="11"/>
-      <w:bookmarkEnd w:id="12"/>
     </w:p>
     <w:p>
       <w:pPr>
@@ -4741,16 +4942,16 @@
           <w:lang w:val="ru-RU"/>
         </w:rPr>
       </w:pPr>
-      <w:bookmarkStart w:id="13" w:name="_Toc168482029"/>
-      <w:bookmarkStart w:id="14" w:name="_Toc195094592"/>
+      <w:bookmarkStart w:id="12" w:name="_Toc168482029"/>
+      <w:bookmarkStart w:id="13" w:name="_Toc195094592"/>
       <w:r>
         <w:rPr>
           <w:lang w:val="ru-RU"/>
         </w:rPr>
         <w:t>2.4.1. Требования к функциональным характеристикам</w:t>
       </w:r>
+      <w:bookmarkEnd w:id="12"/>
       <w:bookmarkEnd w:id="13"/>
-      <w:bookmarkEnd w:id="14"/>
     </w:p>
     <w:p>
       <w:pPr>
@@ -5282,16 +5483,16 @@
           <w:lang w:val="ru-RU"/>
         </w:rPr>
       </w:pPr>
-      <w:bookmarkStart w:id="15" w:name="_Toc168482030"/>
-      <w:bookmarkStart w:id="16" w:name="_Toc195094593"/>
+      <w:bookmarkStart w:id="14" w:name="_Toc168482030"/>
+      <w:bookmarkStart w:id="15" w:name="_Toc195094593"/>
       <w:r>
         <w:rPr>
           <w:lang w:val="ru-RU"/>
         </w:rPr>
         <w:t>2.4.2 Требование к надёжности</w:t>
       </w:r>
+      <w:bookmarkEnd w:id="14"/>
       <w:bookmarkEnd w:id="15"/>
-      <w:bookmarkEnd w:id="16"/>
     </w:p>
     <w:p>
       <w:pPr>
@@ -5456,24 +5657,24 @@
           <w:lang w:val="ru-RU"/>
         </w:rPr>
       </w:pPr>
-      <w:bookmarkStart w:id="17" w:name="_Toc130863862"/>
-      <w:bookmarkStart w:id="18" w:name="_Toc168482031"/>
-      <w:bookmarkStart w:id="19" w:name="_Toc195094594"/>
+      <w:bookmarkStart w:id="16" w:name="_Toc130863862"/>
+      <w:bookmarkStart w:id="17" w:name="_Toc168482031"/>
+      <w:bookmarkStart w:id="18" w:name="_Toc195094594"/>
       <w:r>
         <w:rPr>
           <w:lang w:val="ru-RU"/>
         </w:rPr>
         <w:t>2.4.3. Условия эксплуатаци</w:t>
       </w:r>
+      <w:bookmarkEnd w:id="16"/>
+      <w:r>
+        <w:rPr>
+          <w:lang w:val="ru-RU"/>
+        </w:rPr>
+        <w:t>й</w:t>
+      </w:r>
       <w:bookmarkEnd w:id="17"/>
-      <w:r>
-        <w:rPr>
-          <w:lang w:val="ru-RU"/>
-        </w:rPr>
-        <w:t>й</w:t>
-      </w:r>
       <w:bookmarkEnd w:id="18"/>
-      <w:bookmarkEnd w:id="19"/>
     </w:p>
     <w:p>
       <w:pPr>
@@ -5536,16 +5737,16 @@
           <w:lang w:val="ru-RU"/>
         </w:rPr>
       </w:pPr>
-      <w:bookmarkStart w:id="20" w:name="_Toc168482032"/>
-      <w:bookmarkStart w:id="21" w:name="_Toc195094595"/>
+      <w:bookmarkStart w:id="19" w:name="_Toc168482032"/>
+      <w:bookmarkStart w:id="20" w:name="_Toc195094595"/>
       <w:r>
         <w:rPr>
           <w:lang w:val="ru-RU"/>
         </w:rPr>
         <w:t>2.4.4 Требование к составу и параметрам технических средств</w:t>
       </w:r>
+      <w:bookmarkEnd w:id="19"/>
       <w:bookmarkEnd w:id="20"/>
-      <w:bookmarkEnd w:id="21"/>
     </w:p>
     <w:p>
       <w:pPr>
@@ -5606,8 +5807,8 @@
           <w:lang w:val="ru-RU"/>
         </w:rPr>
       </w:pPr>
-      <w:bookmarkStart w:id="22" w:name="_Toc168482033"/>
-      <w:bookmarkStart w:id="23" w:name="_Toc195094596"/>
+      <w:bookmarkStart w:id="21" w:name="_Toc168482033"/>
+      <w:bookmarkStart w:id="22" w:name="_Toc195094596"/>
       <w:r>
         <w:rPr>
           <w:lang w:val="ru-RU"/>
@@ -5626,8 +5827,8 @@
         </w:rPr>
         <w:t>сти</w:t>
       </w:r>
+      <w:bookmarkEnd w:id="21"/>
       <w:bookmarkEnd w:id="22"/>
-      <w:bookmarkEnd w:id="23"/>
     </w:p>
     <w:p>
       <w:pPr>
@@ -5660,16 +5861,16 @@
           <w:lang w:val="ru-RU"/>
         </w:rPr>
       </w:pPr>
-      <w:bookmarkStart w:id="24" w:name="_Toc168482034"/>
-      <w:bookmarkStart w:id="25" w:name="_Toc195094597"/>
+      <w:bookmarkStart w:id="23" w:name="_Toc168482034"/>
+      <w:bookmarkStart w:id="24" w:name="_Toc195094597"/>
       <w:r>
         <w:rPr>
           <w:lang w:val="ru-RU"/>
         </w:rPr>
         <w:t>2.4.6. Требования к маркировке и упаковке</w:t>
       </w:r>
+      <w:bookmarkEnd w:id="23"/>
       <w:bookmarkEnd w:id="24"/>
-      <w:bookmarkEnd w:id="25"/>
     </w:p>
     <w:p>
       <w:pPr>
@@ -5682,7 +5883,7 @@
           <w:szCs w:val="28"/>
         </w:rPr>
       </w:pPr>
-      <w:bookmarkStart w:id="26" w:name="_Toc168482035"/>
+      <w:bookmarkStart w:id="25" w:name="_Toc168482035"/>
       <w:r>
         <w:rPr>
           <w:rFonts w:ascii="Times New Roman" w:eastAsia="Times New Roman" w:hAnsi="Times New Roman" w:cs="Times New Roman"/>
@@ -5704,15 +5905,15 @@
           <w:lang w:val="ru-RU"/>
         </w:rPr>
       </w:pPr>
-      <w:bookmarkStart w:id="27" w:name="_Toc195094598"/>
+      <w:bookmarkStart w:id="26" w:name="_Toc195094598"/>
       <w:r>
         <w:rPr>
           <w:lang w:val="ru-RU"/>
         </w:rPr>
         <w:t>2.4.7. Требования к транспортированию и хранению</w:t>
       </w:r>
+      <w:bookmarkEnd w:id="25"/>
       <w:bookmarkEnd w:id="26"/>
-      <w:bookmarkEnd w:id="27"/>
     </w:p>
     <w:p>
       <w:pPr>
@@ -5773,16 +5974,16 @@
           <w:lang w:val="ru-RU"/>
         </w:rPr>
       </w:pPr>
-      <w:bookmarkStart w:id="28" w:name="_Toc168482036"/>
-      <w:bookmarkStart w:id="29" w:name="_Toc195094599"/>
+      <w:bookmarkStart w:id="27" w:name="_Toc168482036"/>
+      <w:bookmarkStart w:id="28" w:name="_Toc195094599"/>
       <w:r>
         <w:rPr>
           <w:lang w:val="ru-RU"/>
         </w:rPr>
         <w:t>2.5. Требования к программной документации</w:t>
       </w:r>
+      <w:bookmarkEnd w:id="27"/>
       <w:bookmarkEnd w:id="28"/>
-      <w:bookmarkEnd w:id="29"/>
     </w:p>
     <w:p>
       <w:pPr>
@@ -5897,16 +6098,16 @@
           <w:lang w:val="ru-RU"/>
         </w:rPr>
       </w:pPr>
-      <w:bookmarkStart w:id="30" w:name="_Toc168482037"/>
-      <w:bookmarkStart w:id="31" w:name="_Toc195094600"/>
+      <w:bookmarkStart w:id="29" w:name="_Toc168482037"/>
+      <w:bookmarkStart w:id="30" w:name="_Toc195094600"/>
       <w:r>
         <w:rPr>
           <w:lang w:val="ru-RU"/>
         </w:rPr>
         <w:t>2.6. Технико-экономические показатели</w:t>
       </w:r>
+      <w:bookmarkEnd w:id="29"/>
       <w:bookmarkEnd w:id="30"/>
-      <w:bookmarkEnd w:id="31"/>
     </w:p>
     <w:p>
       <w:pPr>
@@ -5943,16 +6144,16 @@
           <w:lang w:val="ru-RU"/>
         </w:rPr>
       </w:pPr>
-      <w:bookmarkStart w:id="32" w:name="_Toc168482038"/>
-      <w:bookmarkStart w:id="33" w:name="_Toc195094601"/>
+      <w:bookmarkStart w:id="31" w:name="_Toc168482038"/>
+      <w:bookmarkStart w:id="32" w:name="_Toc195094601"/>
       <w:r>
         <w:rPr>
           <w:lang w:val="ru-RU"/>
         </w:rPr>
         <w:t>2.7. Стадии и этапы разработки</w:t>
       </w:r>
+      <w:bookmarkEnd w:id="31"/>
       <w:bookmarkEnd w:id="32"/>
-      <w:bookmarkEnd w:id="33"/>
     </w:p>
     <w:p>
       <w:pPr>
@@ -5999,33 +6200,19 @@
         <w:rPr>
           <w:color w:val="000000" w:themeColor="text1"/>
         </w:rPr>
-        <w:t xml:space="preserve"> анализа предметной области: с *</w:t>
-      </w:r>
-      <w:proofErr w:type="gramStart"/>
+        <w:t xml:space="preserve"> анализа предметной области: с **</w:t>
+      </w:r>
       <w:r>
         <w:rPr>
           <w:color w:val="000000" w:themeColor="text1"/>
         </w:rPr>
-        <w:t>*</w:t>
+        <w:t>.</w:t>
       </w:r>
       <w:r>
         <w:rPr>
           <w:color w:val="000000" w:themeColor="text1"/>
         </w:rPr>
-        <w:t>.</w:t>
-      </w:r>
-      <w:r>
-        <w:rPr>
-          <w:color w:val="000000" w:themeColor="text1"/>
-        </w:rPr>
-        <w:t>*</w:t>
-      </w:r>
-      <w:proofErr w:type="gramEnd"/>
-      <w:r>
-        <w:rPr>
-          <w:color w:val="000000" w:themeColor="text1"/>
-        </w:rPr>
-        <w:t>*</w:t>
+        <w:t>**</w:t>
       </w:r>
       <w:r>
         <w:rPr>
@@ -6086,21 +6273,7 @@
         <w:rPr>
           <w:color w:val="000000" w:themeColor="text1"/>
         </w:rPr>
-        <w:t>с *</w:t>
-      </w:r>
-      <w:proofErr w:type="gramStart"/>
-      <w:r>
-        <w:rPr>
-          <w:color w:val="000000" w:themeColor="text1"/>
-        </w:rPr>
-        <w:t>*.*</w:t>
-      </w:r>
-      <w:proofErr w:type="gramEnd"/>
-      <w:r>
-        <w:rPr>
-          <w:color w:val="000000" w:themeColor="text1"/>
-        </w:rPr>
-        <w:t>*.20** по **.**.20**;</w:t>
+        <w:t>с **.**.20** по **.**.20**;</w:t>
       </w:r>
     </w:p>
     <w:p>
@@ -6130,21 +6303,7 @@
         <w:rPr>
           <w:color w:val="000000" w:themeColor="text1"/>
         </w:rPr>
-        <w:t>с *</w:t>
-      </w:r>
-      <w:proofErr w:type="gramStart"/>
-      <w:r>
-        <w:rPr>
-          <w:color w:val="000000" w:themeColor="text1"/>
-        </w:rPr>
-        <w:t>*.*</w:t>
-      </w:r>
-      <w:proofErr w:type="gramEnd"/>
-      <w:r>
-        <w:rPr>
-          <w:color w:val="000000" w:themeColor="text1"/>
-        </w:rPr>
-        <w:t>*.20** по **.**.20**;</w:t>
+        <w:t>с **.**.20** по **.**.20**;</w:t>
       </w:r>
     </w:p>
     <w:p>
@@ -6174,21 +6333,7 @@
         <w:rPr>
           <w:color w:val="000000" w:themeColor="text1"/>
         </w:rPr>
-        <w:t>с *</w:t>
-      </w:r>
-      <w:proofErr w:type="gramStart"/>
-      <w:r>
-        <w:rPr>
-          <w:color w:val="000000" w:themeColor="text1"/>
-        </w:rPr>
-        <w:t>*.*</w:t>
-      </w:r>
-      <w:proofErr w:type="gramEnd"/>
-      <w:r>
-        <w:rPr>
-          <w:color w:val="000000" w:themeColor="text1"/>
-        </w:rPr>
-        <w:t>*.20** по **.**.20**;</w:t>
+        <w:t>с **.**.20** по **.**.20**;</w:t>
       </w:r>
     </w:p>
     <w:p>
@@ -6202,16 +6347,16 @@
           <w:lang w:val="ru-RU"/>
         </w:rPr>
       </w:pPr>
-      <w:bookmarkStart w:id="34" w:name="_Toc168482039"/>
-      <w:bookmarkStart w:id="35" w:name="_Toc195094602"/>
+      <w:bookmarkStart w:id="33" w:name="_Toc168482039"/>
+      <w:bookmarkStart w:id="34" w:name="_Toc195094602"/>
       <w:r>
         <w:rPr>
           <w:lang w:val="ru-RU"/>
         </w:rPr>
         <w:t>2.8. Порядок контроля и приёмки</w:t>
       </w:r>
+      <w:bookmarkEnd w:id="33"/>
       <w:bookmarkEnd w:id="34"/>
-      <w:bookmarkEnd w:id="35"/>
     </w:p>
     <w:p>
       <w:pPr>
@@ -6364,8 +6509,8 @@
           <w:lang w:val="ru-RU"/>
         </w:rPr>
       </w:pPr>
-      <w:bookmarkStart w:id="36" w:name="_Toc168482040"/>
-      <w:bookmarkStart w:id="37" w:name="_Toc195094603"/>
+      <w:bookmarkStart w:id="35" w:name="_Toc168482040"/>
+      <w:bookmarkStart w:id="36" w:name="_Toc195094603"/>
       <w:r>
         <w:rPr>
           <w:sz w:val="28"/>
@@ -6375,8 +6520,8 @@
         <w:lastRenderedPageBreak/>
         <w:t>Раздел 3. Эскизный проект</w:t>
       </w:r>
+      <w:bookmarkEnd w:id="35"/>
       <w:bookmarkEnd w:id="36"/>
-      <w:bookmarkEnd w:id="37"/>
     </w:p>
     <w:p>
       <w:pPr>
@@ -6389,16 +6534,16 @@
           <w:lang w:val="ru-RU"/>
         </w:rPr>
       </w:pPr>
-      <w:bookmarkStart w:id="38" w:name="_Toc168482041"/>
-      <w:bookmarkStart w:id="39" w:name="_Toc195094604"/>
+      <w:bookmarkStart w:id="37" w:name="_Toc168482041"/>
+      <w:bookmarkStart w:id="38" w:name="_Toc195094604"/>
       <w:r>
         <w:rPr>
           <w:lang w:val="ru-RU"/>
         </w:rPr>
         <w:t>3.1. Структура входных – выходных данных</w:t>
       </w:r>
+      <w:bookmarkEnd w:id="37"/>
       <w:bookmarkEnd w:id="38"/>
-      <w:bookmarkEnd w:id="39"/>
     </w:p>
     <w:p>
       <w:pPr>
@@ -6642,7 +6787,6 @@
                 <w:szCs w:val="24"/>
               </w:rPr>
             </w:pPr>
-            <w:proofErr w:type="spellStart"/>
             <w:r>
               <w:rPr>
                 <w:rFonts w:ascii="Times New Roman" w:hAnsi="Times New Roman" w:cs="Times New Roman"/>
@@ -6651,7 +6795,6 @@
               </w:rPr>
               <w:t>код_пользователя</w:t>
             </w:r>
-            <w:proofErr w:type="spellEnd"/>
           </w:p>
         </w:tc>
         <w:tc>
@@ -6795,23 +6938,13 @@
                 <w:szCs w:val="24"/>
               </w:rPr>
             </w:pPr>
-            <w:proofErr w:type="spellStart"/>
             <w:r>
               <w:rPr>
                 <w:rFonts w:ascii="Times New Roman" w:hAnsi="Times New Roman" w:cs="Times New Roman"/>
                 <w:sz w:val="24"/>
                 <w:szCs w:val="24"/>
               </w:rPr>
-              <w:t>Varchar</w:t>
-            </w:r>
-            <w:proofErr w:type="spellEnd"/>
-            <w:r>
-              <w:rPr>
-                <w:rFonts w:ascii="Times New Roman" w:hAnsi="Times New Roman" w:cs="Times New Roman"/>
-                <w:sz w:val="24"/>
-                <w:szCs w:val="24"/>
-              </w:rPr>
-              <w:t>(50)</w:t>
+              <w:t>Varchar(50)</w:t>
             </w:r>
           </w:p>
         </w:tc>
@@ -6923,23 +7056,13 @@
                 <w:szCs w:val="24"/>
               </w:rPr>
             </w:pPr>
-            <w:proofErr w:type="spellStart"/>
             <w:r>
               <w:rPr>
                 <w:rFonts w:ascii="Times New Roman" w:hAnsi="Times New Roman" w:cs="Times New Roman"/>
                 <w:sz w:val="24"/>
                 <w:szCs w:val="24"/>
               </w:rPr>
-              <w:t>Varchar</w:t>
-            </w:r>
-            <w:proofErr w:type="spellEnd"/>
-            <w:r>
-              <w:rPr>
-                <w:rFonts w:ascii="Times New Roman" w:hAnsi="Times New Roman" w:cs="Times New Roman"/>
-                <w:sz w:val="24"/>
-                <w:szCs w:val="24"/>
-              </w:rPr>
-              <w:t>(25)</w:t>
+              <w:t>Varchar(25)</w:t>
             </w:r>
           </w:p>
         </w:tc>
@@ -7069,23 +7192,13 @@
                 <w:szCs w:val="24"/>
               </w:rPr>
             </w:pPr>
-            <w:proofErr w:type="spellStart"/>
             <w:r>
               <w:rPr>
                 <w:rFonts w:ascii="Times New Roman" w:hAnsi="Times New Roman" w:cs="Times New Roman"/>
                 <w:sz w:val="24"/>
                 <w:szCs w:val="24"/>
               </w:rPr>
-              <w:t>Varchar</w:t>
-            </w:r>
-            <w:proofErr w:type="spellEnd"/>
-            <w:r>
-              <w:rPr>
-                <w:rFonts w:ascii="Times New Roman" w:hAnsi="Times New Roman" w:cs="Times New Roman"/>
-                <w:sz w:val="24"/>
-                <w:szCs w:val="24"/>
-              </w:rPr>
-              <w:t>(50)</w:t>
+              <w:t>Varchar(50)</w:t>
             </w:r>
           </w:p>
         </w:tc>
@@ -7205,23 +7318,13 @@
                 <w:szCs w:val="24"/>
               </w:rPr>
             </w:pPr>
-            <w:proofErr w:type="spellStart"/>
             <w:r>
               <w:rPr>
                 <w:rFonts w:ascii="Times New Roman" w:hAnsi="Times New Roman" w:cs="Times New Roman"/>
                 <w:sz w:val="24"/>
                 <w:szCs w:val="24"/>
               </w:rPr>
-              <w:t>Varchar</w:t>
-            </w:r>
-            <w:proofErr w:type="spellEnd"/>
-            <w:r>
-              <w:rPr>
-                <w:rFonts w:ascii="Times New Roman" w:hAnsi="Times New Roman" w:cs="Times New Roman"/>
-                <w:sz w:val="24"/>
-                <w:szCs w:val="24"/>
-              </w:rPr>
-              <w:t>(150)</w:t>
+              <w:t>Varchar(150)</w:t>
             </w:r>
           </w:p>
         </w:tc>
@@ -7415,23 +7518,13 @@
                 <w:szCs w:val="24"/>
               </w:rPr>
             </w:pPr>
-            <w:proofErr w:type="spellStart"/>
             <w:r>
               <w:rPr>
                 <w:rFonts w:ascii="Times New Roman" w:hAnsi="Times New Roman" w:cs="Times New Roman"/>
                 <w:sz w:val="24"/>
                 <w:szCs w:val="24"/>
               </w:rPr>
-              <w:t>Varchar</w:t>
-            </w:r>
-            <w:proofErr w:type="spellEnd"/>
-            <w:r>
-              <w:rPr>
-                <w:rFonts w:ascii="Times New Roman" w:hAnsi="Times New Roman" w:cs="Times New Roman"/>
-                <w:sz w:val="24"/>
-                <w:szCs w:val="24"/>
-              </w:rPr>
-              <w:t>(50)</w:t>
+              <w:t>Varchar(50)</w:t>
             </w:r>
           </w:p>
         </w:tc>
@@ -7699,7 +7792,6 @@
                 <w:szCs w:val="24"/>
               </w:rPr>
             </w:pPr>
-            <w:proofErr w:type="spellStart"/>
             <w:r>
               <w:rPr>
                 <w:rFonts w:ascii="Times New Roman" w:hAnsi="Times New Roman" w:cs="Times New Roman"/>
@@ -7708,7 +7800,6 @@
               </w:rPr>
               <w:t>id</w:t>
             </w:r>
-            <w:proofErr w:type="spellEnd"/>
           </w:p>
         </w:tc>
         <w:tc>
@@ -7869,23 +7960,13 @@
                 <w:szCs w:val="24"/>
               </w:rPr>
             </w:pPr>
-            <w:proofErr w:type="spellStart"/>
             <w:r>
               <w:rPr>
                 <w:rFonts w:ascii="Times New Roman" w:hAnsi="Times New Roman" w:cs="Times New Roman"/>
                 <w:sz w:val="24"/>
                 <w:szCs w:val="24"/>
               </w:rPr>
-              <w:t>Varchar</w:t>
-            </w:r>
-            <w:proofErr w:type="spellEnd"/>
-            <w:r>
-              <w:rPr>
-                <w:rFonts w:ascii="Times New Roman" w:hAnsi="Times New Roman" w:cs="Times New Roman"/>
-                <w:sz w:val="24"/>
-                <w:szCs w:val="24"/>
-              </w:rPr>
-              <w:t>(50)</w:t>
+              <w:t>Varchar(50)</w:t>
             </w:r>
           </w:p>
         </w:tc>
@@ -8008,23 +8089,13 @@
                 <w:szCs w:val="24"/>
               </w:rPr>
             </w:pPr>
-            <w:proofErr w:type="spellStart"/>
             <w:r>
               <w:rPr>
                 <w:rFonts w:ascii="Times New Roman" w:hAnsi="Times New Roman" w:cs="Times New Roman"/>
                 <w:sz w:val="24"/>
                 <w:szCs w:val="24"/>
               </w:rPr>
-              <w:t>Varchar</w:t>
-            </w:r>
-            <w:proofErr w:type="spellEnd"/>
-            <w:r>
-              <w:rPr>
-                <w:rFonts w:ascii="Times New Roman" w:hAnsi="Times New Roman" w:cs="Times New Roman"/>
-                <w:sz w:val="24"/>
-                <w:szCs w:val="24"/>
-              </w:rPr>
-              <w:t>(50)</w:t>
+              <w:t>Varchar(50)</w:t>
             </w:r>
           </w:p>
         </w:tc>
@@ -8146,7 +8217,6 @@
                 <w:szCs w:val="24"/>
               </w:rPr>
             </w:pPr>
-            <w:proofErr w:type="spellStart"/>
             <w:r>
               <w:rPr>
                 <w:rFonts w:ascii="Times New Roman" w:hAnsi="Times New Roman" w:cs="Times New Roman"/>
@@ -8155,7 +8225,6 @@
               </w:rPr>
               <w:t>text</w:t>
             </w:r>
-            <w:proofErr w:type="spellEnd"/>
           </w:p>
         </w:tc>
         <w:tc>
@@ -8219,8 +8288,8 @@
           <w:lang w:val="ru-RU"/>
         </w:rPr>
       </w:pPr>
-      <w:bookmarkStart w:id="40" w:name="_Toc168482042"/>
-      <w:bookmarkStart w:id="41" w:name="_Toc195094605"/>
+      <w:bookmarkStart w:id="39" w:name="_Toc168482042"/>
+      <w:bookmarkStart w:id="40" w:name="_Toc195094605"/>
       <w:r>
         <w:rPr>
           <w:lang w:val="ru-RU"/>
@@ -8245,8 +8314,8 @@
         </w:rPr>
         <w:t>Макеты интерфейса программы</w:t>
       </w:r>
+      <w:bookmarkEnd w:id="39"/>
       <w:bookmarkEnd w:id="40"/>
-      <w:bookmarkEnd w:id="41"/>
     </w:p>
     <w:p>
       <w:pPr>
@@ -8543,7 +8612,7 @@
 </file>
 
 <file path=word/endnotes.xml><?xml version="1.0" encoding="utf-8"?>
-<w:endnotes xmlns:wpc="http://schemas.microsoft.com/office/word/2010/wordprocessingCanvas" xmlns:cx="http://schemas.microsoft.com/office/drawing/2014/chartex" xmlns:mc="http://schemas.openxmlformats.org/markup-compatibility/2006" xmlns:o="urn:schemas-microsoft-com:office:office" xmlns:r="http://schemas.openxmlformats.org/officeDocument/2006/relationships" xmlns:m="http://schemas.openxmlformats.org/officeDocument/2006/math" xmlns:v="urn:schemas-microsoft-com:vml" xmlns:wp14="http://schemas.microsoft.com/office/word/2010/wordprocessingDrawing" xmlns:wp="http://schemas.openxmlformats.org/drawingml/2006/wordprocessingDrawing" xmlns:w10="urn:schemas-microsoft-com:office:word" xmlns:w="http://schemas.openxmlformats.org/wordprocessingml/2006/main" xmlns:w14="http://schemas.microsoft.com/office/word/2010/wordml" xmlns:w15="http://schemas.microsoft.com/office/word/2012/wordml" xmlns:w16se="http://schemas.microsoft.com/office/word/2015/wordml/symex" xmlns:wpg="http://schemas.microsoft.com/office/word/2010/wordprocessingGroup" xmlns:wpi="http://schemas.microsoft.com/office/word/2010/wordprocessingInk" xmlns:wne="http://schemas.microsoft.com/office/word/2006/wordml" xmlns:wps="http://schemas.microsoft.com/office/word/2010/wordprocessingShape" mc:Ignorable="w14 w15 w16se wp14">
+<w:endnotes xmlns:wpc="http://schemas.microsoft.com/office/word/2010/wordprocessingCanvas" xmlns:cx="http://schemas.microsoft.com/office/drawing/2014/chartex" xmlns:cx1="http://schemas.microsoft.com/office/drawing/2015/9/8/chartex" xmlns:cx2="http://schemas.microsoft.com/office/drawing/2015/10/21/chartex" xmlns:cx3="http://schemas.microsoft.com/office/drawing/2016/5/9/chartex" xmlns:cx4="http://schemas.microsoft.com/office/drawing/2016/5/10/chartex" xmlns:cx5="http://schemas.microsoft.com/office/drawing/2016/5/11/chartex" xmlns:cx6="http://schemas.microsoft.com/office/drawing/2016/5/12/chartex" xmlns:cx7="http://schemas.microsoft.com/office/drawing/2016/5/13/chartex" xmlns:cx8="http://schemas.microsoft.com/office/drawing/2016/5/14/chartex" xmlns:mc="http://schemas.openxmlformats.org/markup-compatibility/2006" xmlns:aink="http://schemas.microsoft.com/office/drawing/2016/ink" xmlns:am3d="http://schemas.microsoft.com/office/drawing/2017/model3d" xmlns:o="urn:schemas-microsoft-com:office:office" xmlns:oel="http://schemas.microsoft.com/office/2019/extlst" xmlns:r="http://schemas.openxmlformats.org/officeDocument/2006/relationships" xmlns:m="http://schemas.openxmlformats.org/officeDocument/2006/math" xmlns:v="urn:schemas-microsoft-com:vml" xmlns:wp14="http://schemas.microsoft.com/office/word/2010/wordprocessingDrawing" xmlns:wp="http://schemas.openxmlformats.org/drawingml/2006/wordprocessingDrawing" xmlns:w10="urn:schemas-microsoft-com:office:word" xmlns:w="http://schemas.openxmlformats.org/wordprocessingml/2006/main" xmlns:w14="http://schemas.microsoft.com/office/word/2010/wordml" xmlns:w15="http://schemas.microsoft.com/office/word/2012/wordml" xmlns:w16cex="http://schemas.microsoft.com/office/word/2018/wordml/cex" xmlns:w16cid="http://schemas.microsoft.com/office/word/2016/wordml/cid" xmlns:w16="http://schemas.microsoft.com/office/word/2018/wordml" xmlns:w16du="http://schemas.microsoft.com/office/word/2023/wordml/word16du" xmlns:w16sdtdh="http://schemas.microsoft.com/office/word/2020/wordml/sdtdatahash" xmlns:w16sdtfl="http://schemas.microsoft.com/office/word/2024/wordml/sdtformatlock" xmlns:w16se="http://schemas.microsoft.com/office/word/2015/wordml/symex" xmlns:wpg="http://schemas.microsoft.com/office/word/2010/wordprocessingGroup" xmlns:wpi="http://schemas.microsoft.com/office/word/2010/wordprocessingInk" xmlns:wne="http://schemas.microsoft.com/office/word/2006/wordml" xmlns:wps="http://schemas.microsoft.com/office/word/2010/wordprocessingShape" mc:Ignorable="w14 w15 w16se w16cid w16 w16cex w16sdtdh w16sdtfl w16du wp14">
   <w:endnote w:type="separator" w:id="-1">
     <w:p>
       <w:pPr>
@@ -8568,7 +8637,7 @@
 </file>
 
 <file path=word/footer1.xml><?xml version="1.0" encoding="utf-8"?>
-<w:ftr xmlns:wpc="http://schemas.microsoft.com/office/word/2010/wordprocessingCanvas" xmlns:cx="http://schemas.microsoft.com/office/drawing/2014/chartex" xmlns:mc="http://schemas.openxmlformats.org/markup-compatibility/2006" xmlns:o="urn:schemas-microsoft-com:office:office" xmlns:r="http://schemas.openxmlformats.org/officeDocument/2006/relationships" xmlns:m="http://schemas.openxmlformats.org/officeDocument/2006/math" xmlns:v="urn:schemas-microsoft-com:vml" xmlns:wp14="http://schemas.microsoft.com/office/word/2010/wordprocessingDrawing" xmlns:wp="http://schemas.openxmlformats.org/drawingml/2006/wordprocessingDrawing" xmlns:w10="urn:schemas-microsoft-com:office:word" xmlns:w="http://schemas.openxmlformats.org/wordprocessingml/2006/main" xmlns:w14="http://schemas.microsoft.com/office/word/2010/wordml" xmlns:w15="http://schemas.microsoft.com/office/word/2012/wordml" xmlns:w16se="http://schemas.microsoft.com/office/word/2015/wordml/symex" xmlns:wpg="http://schemas.microsoft.com/office/word/2010/wordprocessingGroup" xmlns:wpi="http://schemas.microsoft.com/office/word/2010/wordprocessingInk" xmlns:wne="http://schemas.microsoft.com/office/word/2006/wordml" xmlns:wps="http://schemas.microsoft.com/office/word/2010/wordprocessingShape" mc:Ignorable="w14 w15 w16se wp14">
+<w:ftr xmlns:wpc="http://schemas.microsoft.com/office/word/2010/wordprocessingCanvas" xmlns:cx="http://schemas.microsoft.com/office/drawing/2014/chartex" xmlns:cx1="http://schemas.microsoft.com/office/drawing/2015/9/8/chartex" xmlns:cx2="http://schemas.microsoft.com/office/drawing/2015/10/21/chartex" xmlns:cx3="http://schemas.microsoft.com/office/drawing/2016/5/9/chartex" xmlns:cx4="http://schemas.microsoft.com/office/drawing/2016/5/10/chartex" xmlns:cx5="http://schemas.microsoft.com/office/drawing/2016/5/11/chartex" xmlns:cx6="http://schemas.microsoft.com/office/drawing/2016/5/12/chartex" xmlns:cx7="http://schemas.microsoft.com/office/drawing/2016/5/13/chartex" xmlns:cx8="http://schemas.microsoft.com/office/drawing/2016/5/14/chartex" xmlns:mc="http://schemas.openxmlformats.org/markup-compatibility/2006" xmlns:aink="http://schemas.microsoft.com/office/drawing/2016/ink" xmlns:am3d="http://schemas.microsoft.com/office/drawing/2017/model3d" xmlns:o="urn:schemas-microsoft-com:office:office" xmlns:oel="http://schemas.microsoft.com/office/2019/extlst" xmlns:r="http://schemas.openxmlformats.org/officeDocument/2006/relationships" xmlns:m="http://schemas.openxmlformats.org/officeDocument/2006/math" xmlns:v="urn:schemas-microsoft-com:vml" xmlns:wp14="http://schemas.microsoft.com/office/word/2010/wordprocessingDrawing" xmlns:wp="http://schemas.openxmlformats.org/drawingml/2006/wordprocessingDrawing" xmlns:w10="urn:schemas-microsoft-com:office:word" xmlns:w="http://schemas.openxmlformats.org/wordprocessingml/2006/main" xmlns:w14="http://schemas.microsoft.com/office/word/2010/wordml" xmlns:w15="http://schemas.microsoft.com/office/word/2012/wordml" xmlns:w16cex="http://schemas.microsoft.com/office/word/2018/wordml/cex" xmlns:w16cid="http://schemas.microsoft.com/office/word/2016/wordml/cid" xmlns:w16="http://schemas.microsoft.com/office/word/2018/wordml" xmlns:w16du="http://schemas.microsoft.com/office/word/2023/wordml/word16du" xmlns:w16sdtdh="http://schemas.microsoft.com/office/word/2020/wordml/sdtdatahash" xmlns:w16sdtfl="http://schemas.microsoft.com/office/word/2024/wordml/sdtformatlock" xmlns:w16se="http://schemas.microsoft.com/office/word/2015/wordml/symex" xmlns:wpg="http://schemas.microsoft.com/office/word/2010/wordprocessingGroup" xmlns:wpi="http://schemas.microsoft.com/office/word/2010/wordprocessingInk" xmlns:wne="http://schemas.microsoft.com/office/word/2006/wordml" xmlns:wps="http://schemas.microsoft.com/office/word/2010/wordprocessingShape" mc:Ignorable="w14 w15 w16se w16cid w16 w16cex w16sdtdh w16sdtfl w16du wp14">
   <w:p>
     <w:pPr>
       <w:pStyle w:val="a3"/>
@@ -8695,7 +8764,7 @@
               <v:stroke joinstyle="miter"/>
               <v:path gradientshapeok="t" o:connecttype="rect"/>
             </v:shapetype>
-            <v:shape id="Надпись 1" o:spid="_x0000_s1026" type="#_x0000_t202" style="position:absolute;margin-left:310.3pt;margin-top:781pt;width:17.05pt;height:13.05pt;z-index:-251658752;visibility:visible;mso-wrap-style:square;mso-width-percent:0;mso-height-percent:0;mso-wrap-distance-left:9pt;mso-wrap-distance-top:0;mso-wrap-distance-right:9pt;mso-wrap-distance-bottom:0;mso-position-horizontal:absolute;mso-position-horizontal-relative:page;mso-position-vertical:absolute;mso-position-vertical-relative:page;mso-width-percent:0;mso-height-percent:0;mso-width-relative:page;mso-height-relative:page;v-text-anchor:top" o:gfxdata="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" filled="f" stroked="f">
+            <v:shape id="Надпись 1" o:spid="_x0000_s1026" type="#_x0000_t202" style="position:absolute;margin-left:310.3pt;margin-top:781pt;width:17.05pt;height:13.05pt;z-index:-251658752;visibility:visible;mso-wrap-style:square;mso-width-percent:0;mso-height-percent:0;mso-wrap-distance-left:9pt;mso-wrap-distance-top:0;mso-wrap-distance-right:9pt;mso-wrap-distance-bottom:0;mso-position-horizontal:absolute;mso-position-horizontal-relative:page;mso-position-vertical:absolute;mso-position-vertical-relative:page;mso-width-percent:0;mso-height-percent:0;mso-width-relative:page;mso-height-relative:page;v-text-anchor:top" o:gfxdata="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" filled="f" stroked="f">
               <v:textbox inset="0,0,0,0">
                 <w:txbxContent>
                   <w:p>
@@ -8742,7 +8811,7 @@
 </file>
 
 <file path=word/footnotes.xml><?xml version="1.0" encoding="utf-8"?>
-<w:footnotes xmlns:wpc="http://schemas.microsoft.com/office/word/2010/wordprocessingCanvas" xmlns:cx="http://schemas.microsoft.com/office/drawing/2014/chartex" xmlns:mc="http://schemas.openxmlformats.org/markup-compatibility/2006" xmlns:o="urn:schemas-microsoft-com:office:office" xmlns:r="http://schemas.openxmlformats.org/officeDocument/2006/relationships" xmlns:m="http://schemas.openxmlformats.org/officeDocument/2006/math" xmlns:v="urn:schemas-microsoft-com:vml" xmlns:wp14="http://schemas.microsoft.com/office/word/2010/wordprocessingDrawing" xmlns:wp="http://schemas.openxmlformats.org/drawingml/2006/wordprocessingDrawing" xmlns:w10="urn:schemas-microsoft-com:office:word" xmlns:w="http://schemas.openxmlformats.org/wordprocessingml/2006/main" xmlns:w14="http://schemas.microsoft.com/office/word/2010/wordml" xmlns:w15="http://schemas.microsoft.com/office/word/2012/wordml" xmlns:w16se="http://schemas.microsoft.com/office/word/2015/wordml/symex" xmlns:wpg="http://schemas.microsoft.com/office/word/2010/wordprocessingGroup" xmlns:wpi="http://schemas.microsoft.com/office/word/2010/wordprocessingInk" xmlns:wne="http://schemas.microsoft.com/office/word/2006/wordml" xmlns:wps="http://schemas.microsoft.com/office/word/2010/wordprocessingShape" mc:Ignorable="w14 w15 w16se wp14">
+<w:footnotes xmlns:wpc="http://schemas.microsoft.com/office/word/2010/wordprocessingCanvas" xmlns:cx="http://schemas.microsoft.com/office/drawing/2014/chartex" xmlns:cx1="http://schemas.microsoft.com/office/drawing/2015/9/8/chartex" xmlns:cx2="http://schemas.microsoft.com/office/drawing/2015/10/21/chartex" xmlns:cx3="http://schemas.microsoft.com/office/drawing/2016/5/9/chartex" xmlns:cx4="http://schemas.microsoft.com/office/drawing/2016/5/10/chartex" xmlns:cx5="http://schemas.microsoft.com/office/drawing/2016/5/11/chartex" xmlns:cx6="http://schemas.microsoft.com/office/drawing/2016/5/12/chartex" xmlns:cx7="http://schemas.microsoft.com/office/drawing/2016/5/13/chartex" xmlns:cx8="http://schemas.microsoft.com/office/drawing/2016/5/14/chartex" xmlns:mc="http://schemas.openxmlformats.org/markup-compatibility/2006" xmlns:aink="http://schemas.microsoft.com/office/drawing/2016/ink" xmlns:am3d="http://schemas.microsoft.com/office/drawing/2017/model3d" xmlns:o="urn:schemas-microsoft-com:office:office" xmlns:oel="http://schemas.microsoft.com/office/2019/extlst" xmlns:r="http://schemas.openxmlformats.org/officeDocument/2006/relationships" xmlns:m="http://schemas.openxmlformats.org/officeDocument/2006/math" xmlns:v="urn:schemas-microsoft-com:vml" xmlns:wp14="http://schemas.microsoft.com/office/word/2010/wordprocessingDrawing" xmlns:wp="http://schemas.openxmlformats.org/drawingml/2006/wordprocessingDrawing" xmlns:w10="urn:schemas-microsoft-com:office:word" xmlns:w="http://schemas.openxmlformats.org/wordprocessingml/2006/main" xmlns:w14="http://schemas.microsoft.com/office/word/2010/wordml" xmlns:w15="http://schemas.microsoft.com/office/word/2012/wordml" xmlns:w16cex="http://schemas.microsoft.com/office/word/2018/wordml/cex" xmlns:w16cid="http://schemas.microsoft.com/office/word/2016/wordml/cid" xmlns:w16="http://schemas.microsoft.com/office/word/2018/wordml" xmlns:w16du="http://schemas.microsoft.com/office/word/2023/wordml/word16du" xmlns:w16sdtdh="http://schemas.microsoft.com/office/word/2020/wordml/sdtdatahash" xmlns:w16sdtfl="http://schemas.microsoft.com/office/word/2024/wordml/sdtformatlock" xmlns:w16se="http://schemas.microsoft.com/office/word/2015/wordml/symex" xmlns:wpg="http://schemas.microsoft.com/office/word/2010/wordprocessingGroup" xmlns:wpi="http://schemas.microsoft.com/office/word/2010/wordprocessingInk" xmlns:wne="http://schemas.microsoft.com/office/word/2006/wordml" xmlns:wps="http://schemas.microsoft.com/office/word/2010/wordprocessingShape" mc:Ignorable="w14 w15 w16se w16cid w16 w16cex w16sdtdh w16sdtfl w16du wp14">
   <w:footnote w:type="separator" w:id="-1">
     <w:p>
       <w:pPr>
@@ -8767,7 +8836,7 @@
 </file>
 
 <file path=word/numbering.xml><?xml version="1.0" encoding="utf-8"?>
-<w:numbering xmlns:wpc="http://schemas.microsoft.com/office/word/2010/wordprocessingCanvas" xmlns:cx="http://schemas.microsoft.com/office/drawing/2014/chartex" xmlns:mc="http://schemas.openxmlformats.org/markup-compatibility/2006" xmlns:o="urn:schemas-microsoft-com:office:office" xmlns:r="http://schemas.openxmlformats.org/officeDocument/2006/relationships" xmlns:m="http://schemas.openxmlformats.org/officeDocument/2006/math" xmlns:v="urn:schemas-microsoft-com:vml" xmlns:wp14="http://schemas.microsoft.com/office/word/2010/wordprocessingDrawing" xmlns:wp="http://schemas.openxmlformats.org/drawingml/2006/wordprocessingDrawing" xmlns:w10="urn:schemas-microsoft-com:office:word" xmlns:w="http://schemas.openxmlformats.org/wordprocessingml/2006/main" xmlns:w14="http://schemas.microsoft.com/office/word/2010/wordml" xmlns:w15="http://schemas.microsoft.com/office/word/2012/wordml" xmlns:w16se="http://schemas.microsoft.com/office/word/2015/wordml/symex" xmlns:wpg="http://schemas.microsoft.com/office/word/2010/wordprocessingGroup" xmlns:wpi="http://schemas.microsoft.com/office/word/2010/wordprocessingInk" xmlns:wne="http://schemas.microsoft.com/office/word/2006/wordml" xmlns:wps="http://schemas.microsoft.com/office/word/2010/wordprocessingShape" mc:Ignorable="w14 w15 w16se wp14">
+<w:numbering xmlns:wpc="http://schemas.microsoft.com/office/word/2010/wordprocessingCanvas" xmlns:cx="http://schemas.microsoft.com/office/drawing/2014/chartex" xmlns:cx1="http://schemas.microsoft.com/office/drawing/2015/9/8/chartex" xmlns:cx2="http://schemas.microsoft.com/office/drawing/2015/10/21/chartex" xmlns:cx3="http://schemas.microsoft.com/office/drawing/2016/5/9/chartex" xmlns:cx4="http://schemas.microsoft.com/office/drawing/2016/5/10/chartex" xmlns:cx5="http://schemas.microsoft.com/office/drawing/2016/5/11/chartex" xmlns:cx6="http://schemas.microsoft.com/office/drawing/2016/5/12/chartex" xmlns:cx7="http://schemas.microsoft.com/office/drawing/2016/5/13/chartex" xmlns:cx8="http://schemas.microsoft.com/office/drawing/2016/5/14/chartex" xmlns:mc="http://schemas.openxmlformats.org/markup-compatibility/2006" xmlns:aink="http://schemas.microsoft.com/office/drawing/2016/ink" xmlns:am3d="http://schemas.microsoft.com/office/drawing/2017/model3d" xmlns:o="urn:schemas-microsoft-com:office:office" xmlns:oel="http://schemas.microsoft.com/office/2019/extlst" xmlns:r="http://schemas.openxmlformats.org/officeDocument/2006/relationships" xmlns:m="http://schemas.openxmlformats.org/officeDocument/2006/math" xmlns:v="urn:schemas-microsoft-com:vml" xmlns:wp14="http://schemas.microsoft.com/office/word/2010/wordprocessingDrawing" xmlns:wp="http://schemas.openxmlformats.org/drawingml/2006/wordprocessingDrawing" xmlns:w10="urn:schemas-microsoft-com:office:word" xmlns:w="http://schemas.openxmlformats.org/wordprocessingml/2006/main" xmlns:w14="http://schemas.microsoft.com/office/word/2010/wordml" xmlns:w15="http://schemas.microsoft.com/office/word/2012/wordml" xmlns:w16cex="http://schemas.microsoft.com/office/word/2018/wordml/cex" xmlns:w16cid="http://schemas.microsoft.com/office/word/2016/wordml/cid" xmlns:w16="http://schemas.microsoft.com/office/word/2018/wordml" xmlns:w16du="http://schemas.microsoft.com/office/word/2023/wordml/word16du" xmlns:w16sdtdh="http://schemas.microsoft.com/office/word/2020/wordml/sdtdatahash" xmlns:w16sdtfl="http://schemas.microsoft.com/office/word/2024/wordml/sdtformatlock" xmlns:w16se="http://schemas.microsoft.com/office/word/2015/wordml/symex" xmlns:wpg="http://schemas.microsoft.com/office/word/2010/wordprocessingGroup" xmlns:wpi="http://schemas.microsoft.com/office/word/2010/wordprocessingInk" xmlns:wne="http://schemas.microsoft.com/office/word/2006/wordml" xmlns:wps="http://schemas.microsoft.com/office/word/2010/wordprocessingShape" mc:Ignorable="w14 w15 w16se w16cid w16 w16cex w16sdtdh w16sdtfl w16du wp14">
   <w:abstractNum w:abstractNumId="0" w15:restartNumberingAfterBreak="0">
     <w:nsid w:val="01275A3E"/>
     <w:multiLevelType w:val="hybridMultilevel"/>
@@ -12359,16 +12428,16 @@
       </w:rPr>
     </w:lvl>
   </w:abstractNum>
-  <w:num w:numId="1">
+  <w:num w:numId="1" w16cid:durableId="768278845">
     <w:abstractNumId w:val="25"/>
   </w:num>
-  <w:num w:numId="2">
+  <w:num w:numId="2" w16cid:durableId="1774669959">
     <w:abstractNumId w:val="22"/>
   </w:num>
-  <w:num w:numId="3">
+  <w:num w:numId="3" w16cid:durableId="42365720">
     <w:abstractNumId w:val="11"/>
   </w:num>
-  <w:num w:numId="4">
+  <w:num w:numId="4" w16cid:durableId="1993440739">
     <w:abstractNumId w:val="7"/>
     <w:lvlOverride w:ilvl="0">
       <w:startOverride w:val="2"/>
@@ -12398,92 +12467,92 @@
       <w:startOverride w:val="1"/>
     </w:lvlOverride>
   </w:num>
-  <w:num w:numId="5">
+  <w:num w:numId="5" w16cid:durableId="538468108">
     <w:abstractNumId w:val="15"/>
   </w:num>
-  <w:num w:numId="6">
+  <w:num w:numId="6" w16cid:durableId="2082025644">
     <w:abstractNumId w:val="20"/>
   </w:num>
-  <w:num w:numId="7">
+  <w:num w:numId="7" w16cid:durableId="1257471768">
     <w:abstractNumId w:val="29"/>
   </w:num>
-  <w:num w:numId="8">
+  <w:num w:numId="8" w16cid:durableId="360084507">
     <w:abstractNumId w:val="12"/>
   </w:num>
-  <w:num w:numId="9">
+  <w:num w:numId="9" w16cid:durableId="885263228">
     <w:abstractNumId w:val="30"/>
   </w:num>
-  <w:num w:numId="10">
+  <w:num w:numId="10" w16cid:durableId="250434482">
     <w:abstractNumId w:val="0"/>
   </w:num>
-  <w:num w:numId="11">
+  <w:num w:numId="11" w16cid:durableId="1577203292">
     <w:abstractNumId w:val="27"/>
   </w:num>
-  <w:num w:numId="12">
+  <w:num w:numId="12" w16cid:durableId="2051566414">
     <w:abstractNumId w:val="1"/>
   </w:num>
-  <w:num w:numId="13">
+  <w:num w:numId="13" w16cid:durableId="935558904">
     <w:abstractNumId w:val="13"/>
   </w:num>
-  <w:num w:numId="14">
+  <w:num w:numId="14" w16cid:durableId="587693896">
     <w:abstractNumId w:val="21"/>
   </w:num>
-  <w:num w:numId="15">
+  <w:num w:numId="15" w16cid:durableId="1028063252">
     <w:abstractNumId w:val="6"/>
   </w:num>
-  <w:num w:numId="16">
+  <w:num w:numId="16" w16cid:durableId="214121935">
     <w:abstractNumId w:val="16"/>
   </w:num>
-  <w:num w:numId="17">
+  <w:num w:numId="17" w16cid:durableId="176771974">
     <w:abstractNumId w:val="19"/>
   </w:num>
-  <w:num w:numId="18">
+  <w:num w:numId="18" w16cid:durableId="665741994">
     <w:abstractNumId w:val="4"/>
   </w:num>
-  <w:num w:numId="19">
+  <w:num w:numId="19" w16cid:durableId="2009407859">
     <w:abstractNumId w:val="17"/>
   </w:num>
-  <w:num w:numId="20">
+  <w:num w:numId="20" w16cid:durableId="1373193803">
     <w:abstractNumId w:val="28"/>
   </w:num>
-  <w:num w:numId="21">
+  <w:num w:numId="21" w16cid:durableId="2108187998">
     <w:abstractNumId w:val="2"/>
   </w:num>
-  <w:num w:numId="22">
+  <w:num w:numId="22" w16cid:durableId="1797988962">
     <w:abstractNumId w:val="23"/>
   </w:num>
-  <w:num w:numId="23">
+  <w:num w:numId="23" w16cid:durableId="686952361">
     <w:abstractNumId w:val="8"/>
   </w:num>
-  <w:num w:numId="24">
+  <w:num w:numId="24" w16cid:durableId="1783450787">
     <w:abstractNumId w:val="10"/>
   </w:num>
-  <w:num w:numId="25">
+  <w:num w:numId="25" w16cid:durableId="545488053">
     <w:abstractNumId w:val="9"/>
   </w:num>
-  <w:num w:numId="26">
+  <w:num w:numId="26" w16cid:durableId="1626109942">
     <w:abstractNumId w:val="26"/>
   </w:num>
-  <w:num w:numId="27">
+  <w:num w:numId="27" w16cid:durableId="640234914">
     <w:abstractNumId w:val="3"/>
   </w:num>
-  <w:num w:numId="28">
+  <w:num w:numId="28" w16cid:durableId="1421413090">
     <w:abstractNumId w:val="14"/>
   </w:num>
-  <w:num w:numId="29">
+  <w:num w:numId="29" w16cid:durableId="1123619885">
     <w:abstractNumId w:val="5"/>
   </w:num>
-  <w:num w:numId="30">
+  <w:num w:numId="30" w16cid:durableId="618802411">
     <w:abstractNumId w:val="24"/>
   </w:num>
-  <w:num w:numId="31">
+  <w:num w:numId="31" w16cid:durableId="1168709578">
     <w:abstractNumId w:val="18"/>
   </w:num>
 </w:numbering>
 </file>
 
 <file path=word/styles.xml><?xml version="1.0" encoding="utf-8"?>
-<w:styles xmlns:mc="http://schemas.openxmlformats.org/markup-compatibility/2006" xmlns:r="http://schemas.openxmlformats.org/officeDocument/2006/relationships" xmlns:w="http://schemas.openxmlformats.org/wordprocessingml/2006/main" xmlns:w14="http://schemas.microsoft.com/office/word/2010/wordml" xmlns:w15="http://schemas.microsoft.com/office/word/2012/wordml" xmlns:w16se="http://schemas.microsoft.com/office/word/2015/wordml/symex" mc:Ignorable="w14 w15 w16se">
+<w:styles xmlns:mc="http://schemas.openxmlformats.org/markup-compatibility/2006" xmlns:r="http://schemas.openxmlformats.org/officeDocument/2006/relationships" xmlns:w="http://schemas.openxmlformats.org/wordprocessingml/2006/main" xmlns:w14="http://schemas.microsoft.com/office/word/2010/wordml" xmlns:w15="http://schemas.microsoft.com/office/word/2012/wordml" xmlns:w16cex="http://schemas.microsoft.com/office/word/2018/wordml/cex" xmlns:w16cid="http://schemas.microsoft.com/office/word/2016/wordml/cid" xmlns:w16="http://schemas.microsoft.com/office/word/2018/wordml" xmlns:w16du="http://schemas.microsoft.com/office/word/2023/wordml/word16du" xmlns:w16sdtdh="http://schemas.microsoft.com/office/word/2020/wordml/sdtdatahash" xmlns:w16sdtfl="http://schemas.microsoft.com/office/word/2024/wordml/sdtformatlock" xmlns:w16se="http://schemas.microsoft.com/office/word/2015/wordml/symex" mc:Ignorable="w14 w15 w16se w16cid w16 w16cex w16sdtdh w16sdtfl w16du">
   <w:docDefaults>
     <w:rPrDefault>
       <w:rPr>
@@ -12499,7 +12568,7 @@
       </w:pPr>
     </w:pPrDefault>
   </w:docDefaults>
-  <w:latentStyles w:defLockedState="0" w:defUIPriority="99" w:defSemiHidden="0" w:defUnhideWhenUsed="0" w:defQFormat="0" w:count="371">
+  <w:latentStyles w:defLockedState="0" w:defUIPriority="99" w:defSemiHidden="0" w:defUnhideWhenUsed="0" w:defQFormat="0" w:count="376">
     <w:lsdException w:name="Normal" w:uiPriority="0" w:qFormat="1"/>
     <w:lsdException w:name="heading 1" w:uiPriority="0" w:qFormat="1"/>
     <w:lsdException w:name="heading 2" w:semiHidden="1" w:uiPriority="0" w:unhideWhenUsed="1" w:qFormat="1"/>
@@ -12871,6 +12940,11 @@
     <w:lsdException w:name="List Table 5 Dark Accent 6" w:uiPriority="50"/>
     <w:lsdException w:name="List Table 6 Colorful Accent 6" w:uiPriority="51"/>
     <w:lsdException w:name="List Table 7 Colorful Accent 6" w:uiPriority="52"/>
+    <w:lsdException w:name="Mention" w:semiHidden="1" w:unhideWhenUsed="1"/>
+    <w:lsdException w:name="Smart Hyperlink" w:semiHidden="1" w:unhideWhenUsed="1"/>
+    <w:lsdException w:name="Hashtag" w:semiHidden="1" w:unhideWhenUsed="1"/>
+    <w:lsdException w:name="Unresolved Mention" w:semiHidden="1" w:unhideWhenUsed="1"/>
+    <w:lsdException w:name="Smart Link" w:semiHidden="1" w:unhideWhenUsed="1"/>
   </w:latentStyles>
   <w:style w:type="paragraph" w:default="1" w:styleId="a">
     <w:name w:val="Normal"/>
@@ -12947,7 +13021,6 @@
   <w:style w:type="character" w:default="1" w:styleId="a0">
     <w:name w:val="Default Paragraph Font"/>
     <w:uiPriority w:val="1"/>
-    <w:semiHidden/>
     <w:unhideWhenUsed/>
   </w:style>
   <w:style w:type="table" w:default="1" w:styleId="a1">

</xml_diff>